<commit_message>
feat(templates): word headers with logos, {%tr for %} table rows, Jinja filters and yellow highlighting (Items 2-5)
</commit_message>
<xml_diff>
--- a/templates/bill_certificate/template.docx
+++ b/templates/bill_certificate/template.docx
@@ -4,86 +4,100 @@
   <w:body>
     <w:p>
       <w:pPr>
+        <w:spacing w:before="80" w:after="40"/>
         <w:jc w:val="center"/>
       </w:pPr>
       <w:r>
         <w:rPr>
           <w:rFonts w:ascii="Times New Roman" w:hAnsi="Times New Roman"/>
           <w:b/>
-          <w:sz w:val="24"/>
-        </w:rPr>
-        <w:t>SARDAR VALLABHBHAI NATIONAL INSTITUTE OF TECHNOLOGY, SURAT</w:t>
-        <w:br/>
-      </w:r>
-      <w:r>
-        <w:rPr>
-          <w:rFonts w:ascii="Times New Roman" w:hAnsi="Times New Roman"/>
-          <w:b/>
           <w:sz w:val="21"/>
         </w:rPr>
-        <w:t>FORM BC-R: BILL CERTIFICATE &amp; REIMBURSEMENT PROFORMA</w:t>
+        <w:t>DEAN STUDENT WELFARE</w:t>
         <w:br/>
-        <w:t>Dean (Student Welfare) Office</w:t>
+        <w:t>FORM BC-R</w:t>
+        <w:br/>
+        <w:t>BILL CERTIFICATE (RECURRING EXPENDITURE)</w:t>
       </w:r>
     </w:p>
     <w:p>
       <w:pPr>
-        <w:spacing w:before="160" w:after="120"/>
+        <w:spacing w:before="80" w:after="80"/>
       </w:pPr>
       <w:r>
         <w:rPr>
           <w:rFonts w:ascii="Times New Roman" w:hAnsi="Times New Roman"/>
           <w:sz w:val="19"/>
         </w:rPr>
-        <w:t>Approval Note No.: {{ approval_note_no or '[TO BE FILLED]' }}</w:t>
+        <w:t>Chapter Name: {{ chapter_name }}</w:t>
         <w:tab/>
         <w:tab/>
-        <w:t>Approval Date: {{ approval_date or '[TO BE FILLED]' }}</w:t>
+        <w:t>Code No.: {{ chapter_code }}</w:t>
+        <w:br/>
+        <w:t>Approval Note No.: {{ approval_note_no }}</w:t>
+        <w:tab/>
+        <w:tab/>
+        <w:t>Date: {{ approval_date | date_dmy }}</w:t>
+        <w:br/>
+        <w:t>Original Approval Note/Comparative Statement attached herewith/sent with bill No. {{ bill_no }} dtd.: {{ bill_date | date_dmy }} for Rs. {{ bill_amount }} of M/s. {{ supplier_name }}</w:t>
+        <w:br/>
+        <w:t>Purchase Order No. and date : {{ purchase_order }}</w:t>
+        <w:br/>
+        <w:t>Head of Account (Code No.) : {{ head_of_account }}</w:t>
+        <w:br/>
+        <w:t>Advance drawn in Rs. (if any) : {{ advance_drawn }}</w:t>
       </w:r>
     </w:p>
     <w:p>
+      <w:pPr>
+        <w:spacing w:before="120" w:after="120"/>
+      </w:pPr>
       <w:r>
         <w:rPr>
           <w:rFonts w:ascii="Times New Roman" w:hAnsi="Times New Roman"/>
           <w:b/>
+          <w:i/>
           <w:sz w:val="19"/>
         </w:rPr>
-        <w:t>Event: {{ event_title or '[TO BE FILLED]' }} | Head of Account: {{ head_of_account or '[TO BE FILLED]' }}</w:t>
-      </w:r>
-    </w:p>
-    <w:p>
-      <w:r>
-        <w:rPr>
-          <w:b/>
-        </w:rPr>
-        <w:t>Purchased Items / Services Details:</w:t>
+        <w:t>"I, {{ certifying_person }}, personally satisfied that the goods (described below) purchased are of the requisite quality and specification and have been purchased from a reliable supplier / contractor at a reasonable price."</w:t>
       </w:r>
     </w:p>
     <w:tbl>
       <w:tblPr>
         <w:tblW w:type="auto" w:w="0"/>
         <w:jc w:val="center"/>
-        <w:tblLayout w:type="fixed"/>
         <w:tblLook w:firstColumn="1" w:firstRow="1" w:lastColumn="0" w:lastRow="0" w:noHBand="0" w:noVBand="1" w:val="04A0"/>
       </w:tblPr>
       <w:tblGrid>
-        <w:gridCol w:w="1987"/>
-        <w:gridCol w:w="1987"/>
-        <w:gridCol w:w="1987"/>
-        <w:gridCol w:w="1987"/>
-        <w:gridCol w:w="1987"/>
+        <w:gridCol w:w="864"/>
+        <w:gridCol w:w="4608"/>
+        <w:gridCol w:w="1152"/>
+        <w:gridCol w:w="1584"/>
+        <w:gridCol w:w="1728"/>
       </w:tblGrid>
       <w:tr>
         <w:tc>
           <w:tcPr>
-            <w:tcW w:type="dxa" w:w="1987"/>
-            <w:shd w:fill="EAECEE"/>
+            <w:tcW w:type="dxa" w:w="2045"/>
+            <w:shd w:fill="EAEAEA"/>
             <w:tcMar>
-              <w:top w:w="100" w:type="dxa"/>
-              <w:bottom w:w="100" w:type="dxa"/>
-              <w:left w:w="150" w:type="dxa"/>
-              <w:right w:w="150" w:type="dxa"/>
+              <w:top w:w="60" w:type="dxa"/>
+              <w:bottom w:w="60" w:type="dxa"/>
+              <w:left w:w="80" w:type="dxa"/>
+              <w:right w:w="80" w:type="dxa"/>
             </w:tcMar>
+            <w:tcMar>
+              <w:top w:w="50" w:type="dxa"/>
+              <w:bottom w:w="50" w:type="dxa"/>
+              <w:left w:w="80" w:type="dxa"/>
+              <w:right w:w="80" w:type="dxa"/>
+            </w:tcMar>
+            <w:tcBorders>
+              <w:top w:val="single" w:sz="4" w:space="0" w:color="888888"/>
+              <w:left w:val="single" w:sz="4" w:space="0" w:color="888888"/>
+              <w:bottom w:val="single" w:sz="4" w:space="0" w:color="888888"/>
+              <w:right w:val="single" w:sz="4" w:space="0" w:color="888888"/>
+            </w:tcBorders>
           </w:tcPr>
           <w:p>
             <w:r>
@@ -92,20 +106,32 @@
                 <w:b/>
                 <w:sz w:val="18"/>
               </w:rPr>
-              <w:t>Sr No</w:t>
+              <w:t>Sr. No.</w:t>
             </w:r>
           </w:p>
         </w:tc>
         <w:tc>
           <w:tcPr>
-            <w:tcW w:type="dxa" w:w="1987"/>
-            <w:shd w:fill="EAECEE"/>
+            <w:tcW w:type="dxa" w:w="2045"/>
+            <w:shd w:fill="EAEAEA"/>
             <w:tcMar>
-              <w:top w:w="100" w:type="dxa"/>
-              <w:bottom w:w="100" w:type="dxa"/>
-              <w:left w:w="150" w:type="dxa"/>
-              <w:right w:w="150" w:type="dxa"/>
+              <w:top w:w="60" w:type="dxa"/>
+              <w:bottom w:w="60" w:type="dxa"/>
+              <w:left w:w="80" w:type="dxa"/>
+              <w:right w:w="80" w:type="dxa"/>
             </w:tcMar>
+            <w:tcMar>
+              <w:top w:w="50" w:type="dxa"/>
+              <w:bottom w:w="50" w:type="dxa"/>
+              <w:left w:w="80" w:type="dxa"/>
+              <w:right w:w="80" w:type="dxa"/>
+            </w:tcMar>
+            <w:tcBorders>
+              <w:top w:val="single" w:sz="4" w:space="0" w:color="888888"/>
+              <w:left w:val="single" w:sz="4" w:space="0" w:color="888888"/>
+              <w:bottom w:val="single" w:sz="4" w:space="0" w:color="888888"/>
+              <w:right w:val="single" w:sz="4" w:space="0" w:color="888888"/>
+            </w:tcBorders>
           </w:tcPr>
           <w:p>
             <w:r>
@@ -114,20 +140,32 @@
                 <w:b/>
                 <w:sz w:val="18"/>
               </w:rPr>
-              <w:t>Item Description</w:t>
+              <w:t>Name of the Equipment/ item(s)</w:t>
             </w:r>
           </w:p>
         </w:tc>
         <w:tc>
           <w:tcPr>
-            <w:tcW w:type="dxa" w:w="1987"/>
-            <w:shd w:fill="EAECEE"/>
+            <w:tcW w:type="dxa" w:w="2045"/>
+            <w:shd w:fill="EAEAEA"/>
             <w:tcMar>
-              <w:top w:w="100" w:type="dxa"/>
-              <w:bottom w:w="100" w:type="dxa"/>
-              <w:left w:w="150" w:type="dxa"/>
-              <w:right w:w="150" w:type="dxa"/>
+              <w:top w:w="60" w:type="dxa"/>
+              <w:bottom w:w="60" w:type="dxa"/>
+              <w:left w:w="80" w:type="dxa"/>
+              <w:right w:w="80" w:type="dxa"/>
             </w:tcMar>
+            <w:tcMar>
+              <w:top w:w="50" w:type="dxa"/>
+              <w:bottom w:w="50" w:type="dxa"/>
+              <w:left w:w="80" w:type="dxa"/>
+              <w:right w:w="80" w:type="dxa"/>
+            </w:tcMar>
+            <w:tcBorders>
+              <w:top w:val="single" w:sz="4" w:space="0" w:color="888888"/>
+              <w:left w:val="single" w:sz="4" w:space="0" w:color="888888"/>
+              <w:bottom w:val="single" w:sz="4" w:space="0" w:color="888888"/>
+              <w:right w:val="single" w:sz="4" w:space="0" w:color="888888"/>
+            </w:tcBorders>
           </w:tcPr>
           <w:p>
             <w:r>
@@ -136,20 +174,32 @@
                 <w:b/>
                 <w:sz w:val="18"/>
               </w:rPr>
-              <w:t>Qty</w:t>
+              <w:t>Quantity</w:t>
             </w:r>
           </w:p>
         </w:tc>
         <w:tc>
           <w:tcPr>
-            <w:tcW w:type="dxa" w:w="1987"/>
-            <w:shd w:fill="EAECEE"/>
+            <w:tcW w:type="dxa" w:w="2045"/>
+            <w:shd w:fill="EAEAEA"/>
             <w:tcMar>
-              <w:top w:w="100" w:type="dxa"/>
-              <w:bottom w:w="100" w:type="dxa"/>
-              <w:left w:w="150" w:type="dxa"/>
-              <w:right w:w="150" w:type="dxa"/>
+              <w:top w:w="60" w:type="dxa"/>
+              <w:bottom w:w="60" w:type="dxa"/>
+              <w:left w:w="80" w:type="dxa"/>
+              <w:right w:w="80" w:type="dxa"/>
             </w:tcMar>
+            <w:tcMar>
+              <w:top w:w="50" w:type="dxa"/>
+              <w:bottom w:w="50" w:type="dxa"/>
+              <w:left w:w="80" w:type="dxa"/>
+              <w:right w:w="80" w:type="dxa"/>
+            </w:tcMar>
+            <w:tcBorders>
+              <w:top w:val="single" w:sz="4" w:space="0" w:color="888888"/>
+              <w:left w:val="single" w:sz="4" w:space="0" w:color="888888"/>
+              <w:bottom w:val="single" w:sz="4" w:space="0" w:color="888888"/>
+              <w:right w:val="single" w:sz="4" w:space="0" w:color="888888"/>
+            </w:tcBorders>
           </w:tcPr>
           <w:p>
             <w:r>
@@ -158,20 +208,32 @@
                 <w:b/>
                 <w:sz w:val="18"/>
               </w:rPr>
-              <w:t>Unit Cost (₹)</w:t>
+              <w:t>Unit Cost (Rs.)</w:t>
             </w:r>
           </w:p>
         </w:tc>
         <w:tc>
           <w:tcPr>
-            <w:tcW w:type="dxa" w:w="1987"/>
-            <w:shd w:fill="EAECEE"/>
+            <w:tcW w:type="dxa" w:w="2045"/>
+            <w:shd w:fill="EAEAEA"/>
             <w:tcMar>
-              <w:top w:w="100" w:type="dxa"/>
-              <w:bottom w:w="100" w:type="dxa"/>
-              <w:left w:w="150" w:type="dxa"/>
-              <w:right w:w="150" w:type="dxa"/>
+              <w:top w:w="60" w:type="dxa"/>
+              <w:bottom w:w="60" w:type="dxa"/>
+              <w:left w:w="80" w:type="dxa"/>
+              <w:right w:w="80" w:type="dxa"/>
             </w:tcMar>
+            <w:tcMar>
+              <w:top w:w="50" w:type="dxa"/>
+              <w:bottom w:w="50" w:type="dxa"/>
+              <w:left w:w="80" w:type="dxa"/>
+              <w:right w:w="80" w:type="dxa"/>
+            </w:tcMar>
+            <w:tcBorders>
+              <w:top w:val="single" w:sz="4" w:space="0" w:color="888888"/>
+              <w:left w:val="single" w:sz="4" w:space="0" w:color="888888"/>
+              <w:bottom w:val="single" w:sz="4" w:space="0" w:color="888888"/>
+              <w:right w:val="single" w:sz="4" w:space="0" w:color="888888"/>
+            </w:tcBorders>
           </w:tcPr>
           <w:p>
             <w:r>
@@ -180,7 +242,7 @@
                 <w:b/>
                 <w:sz w:val="18"/>
               </w:rPr>
-              <w:t>Total (₹)</w:t>
+              <w:t>Total Cost of Item(s) (Rs.)</w:t>
             </w:r>
           </w:p>
         </w:tc>
@@ -188,103 +250,481 @@
       <w:tr>
         <w:tc>
           <w:tcPr>
-            <w:tcW w:type="dxa" w:w="1987"/>
+            <w:tcW w:type="dxa" w:w="2045"/>
             <w:tcMar>
-              <w:top w:w="100" w:type="dxa"/>
-              <w:bottom w:w="100" w:type="dxa"/>
-              <w:left w:w="150" w:type="dxa"/>
-              <w:right w:w="150" w:type="dxa"/>
+              <w:top w:w="50" w:type="dxa"/>
+              <w:bottom w:w="50" w:type="dxa"/>
+              <w:left w:w="80" w:type="dxa"/>
+              <w:right w:w="80" w:type="dxa"/>
             </w:tcMar>
+            <w:tcBorders>
+              <w:top w:val="single" w:sz="4" w:space="0" w:color="888888"/>
+              <w:left w:val="single" w:sz="4" w:space="0" w:color="888888"/>
+              <w:bottom w:val="single" w:sz="4" w:space="0" w:color="888888"/>
+              <w:right w:val="single" w:sz="4" w:space="0" w:color="888888"/>
+            </w:tcBorders>
           </w:tcPr>
           <w:p>
             <w:r>
-              <w:rPr>
-                <w:rFonts w:ascii="Times New Roman" w:hAnsi="Times New Roman"/>
-                <w:sz w:val="18"/>
-              </w:rPr>
-              <w:t>{% for item in items %}{{ loop.index }}</w:t>
+              <w:t>{%tr for item in items %}</w:t>
             </w:r>
           </w:p>
         </w:tc>
         <w:tc>
           <w:tcPr>
-            <w:tcW w:type="dxa" w:w="1987"/>
+            <w:tcW w:type="dxa" w:w="2045"/>
             <w:tcMar>
-              <w:top w:w="100" w:type="dxa"/>
-              <w:bottom w:w="100" w:type="dxa"/>
-              <w:left w:w="150" w:type="dxa"/>
-              <w:right w:w="150" w:type="dxa"/>
+              <w:top w:w="50" w:type="dxa"/>
+              <w:bottom w:w="50" w:type="dxa"/>
+              <w:left w:w="80" w:type="dxa"/>
+              <w:right w:w="80" w:type="dxa"/>
             </w:tcMar>
+            <w:tcBorders>
+              <w:top w:val="single" w:sz="4" w:space="0" w:color="888888"/>
+              <w:left w:val="single" w:sz="4" w:space="0" w:color="888888"/>
+              <w:bottom w:val="single" w:sz="4" w:space="0" w:color="888888"/>
+              <w:right w:val="single" w:sz="4" w:space="0" w:color="888888"/>
+            </w:tcBorders>
+          </w:tcPr>
+          <w:p/>
+        </w:tc>
+        <w:tc>
+          <w:tcPr>
+            <w:tcW w:type="dxa" w:w="2045"/>
+            <w:tcMar>
+              <w:top w:w="50" w:type="dxa"/>
+              <w:bottom w:w="50" w:type="dxa"/>
+              <w:left w:w="80" w:type="dxa"/>
+              <w:right w:w="80" w:type="dxa"/>
+            </w:tcMar>
+            <w:tcBorders>
+              <w:top w:val="single" w:sz="4" w:space="0" w:color="888888"/>
+              <w:left w:val="single" w:sz="4" w:space="0" w:color="888888"/>
+              <w:bottom w:val="single" w:sz="4" w:space="0" w:color="888888"/>
+              <w:right w:val="single" w:sz="4" w:space="0" w:color="888888"/>
+            </w:tcBorders>
+          </w:tcPr>
+          <w:p/>
+        </w:tc>
+        <w:tc>
+          <w:tcPr>
+            <w:tcW w:type="dxa" w:w="2045"/>
+            <w:tcMar>
+              <w:top w:w="50" w:type="dxa"/>
+              <w:bottom w:w="50" w:type="dxa"/>
+              <w:left w:w="80" w:type="dxa"/>
+              <w:right w:w="80" w:type="dxa"/>
+            </w:tcMar>
+            <w:tcBorders>
+              <w:top w:val="single" w:sz="4" w:space="0" w:color="888888"/>
+              <w:left w:val="single" w:sz="4" w:space="0" w:color="888888"/>
+              <w:bottom w:val="single" w:sz="4" w:space="0" w:color="888888"/>
+              <w:right w:val="single" w:sz="4" w:space="0" w:color="888888"/>
+            </w:tcBorders>
+          </w:tcPr>
+          <w:p/>
+        </w:tc>
+        <w:tc>
+          <w:tcPr>
+            <w:tcW w:type="dxa" w:w="2045"/>
+            <w:tcMar>
+              <w:top w:w="50" w:type="dxa"/>
+              <w:bottom w:w="50" w:type="dxa"/>
+              <w:left w:w="80" w:type="dxa"/>
+              <w:right w:w="80" w:type="dxa"/>
+            </w:tcMar>
+            <w:tcBorders>
+              <w:top w:val="single" w:sz="4" w:space="0" w:color="888888"/>
+              <w:left w:val="single" w:sz="4" w:space="0" w:color="888888"/>
+              <w:bottom w:val="single" w:sz="4" w:space="0" w:color="888888"/>
+              <w:right w:val="single" w:sz="4" w:space="0" w:color="888888"/>
+            </w:tcBorders>
+          </w:tcPr>
+          <w:p/>
+        </w:tc>
+      </w:tr>
+      <w:tr>
+        <w:tc>
+          <w:tcPr>
+            <w:tcW w:type="dxa" w:w="2045"/>
+            <w:tcMar>
+              <w:top w:w="50" w:type="dxa"/>
+              <w:bottom w:w="50" w:type="dxa"/>
+              <w:left w:w="80" w:type="dxa"/>
+              <w:right w:w="80" w:type="dxa"/>
+            </w:tcMar>
+            <w:tcBorders>
+              <w:top w:val="single" w:sz="4" w:space="0" w:color="888888"/>
+              <w:left w:val="single" w:sz="4" w:space="0" w:color="888888"/>
+              <w:bottom w:val="single" w:sz="4" w:space="0" w:color="888888"/>
+              <w:right w:val="single" w:sz="4" w:space="0" w:color="888888"/>
+            </w:tcBorders>
           </w:tcPr>
           <w:p>
             <w:r>
-              <w:rPr>
-                <w:rFonts w:ascii="Times New Roman" w:hAnsi="Times New Roman"/>
-                <w:sz w:val="18"/>
-              </w:rPr>
-              <w:t>{{ item.name }}</w:t>
+              <w:t>{{ loop.index }}</w:t>
             </w:r>
           </w:p>
         </w:tc>
         <w:tc>
           <w:tcPr>
-            <w:tcW w:type="dxa" w:w="1987"/>
+            <w:tcW w:type="dxa" w:w="2045"/>
             <w:tcMar>
-              <w:top w:w="100" w:type="dxa"/>
-              <w:bottom w:w="100" w:type="dxa"/>
-              <w:left w:w="150" w:type="dxa"/>
-              <w:right w:w="150" w:type="dxa"/>
+              <w:top w:w="50" w:type="dxa"/>
+              <w:bottom w:w="50" w:type="dxa"/>
+              <w:left w:w="80" w:type="dxa"/>
+              <w:right w:w="80" w:type="dxa"/>
             </w:tcMar>
+            <w:tcBorders>
+              <w:top w:val="single" w:sz="4" w:space="0" w:color="888888"/>
+              <w:left w:val="single" w:sz="4" w:space="0" w:color="888888"/>
+              <w:bottom w:val="single" w:sz="4" w:space="0" w:color="888888"/>
+              <w:right w:val="single" w:sz="4" w:space="0" w:color="888888"/>
+            </w:tcBorders>
           </w:tcPr>
           <w:p>
             <w:r>
-              <w:rPr>
-                <w:rFonts w:ascii="Times New Roman" w:hAnsi="Times New Roman"/>
-                <w:sz w:val="18"/>
-              </w:rPr>
+              <w:t>{{ item.item_name }}</w:t>
+            </w:r>
+          </w:p>
+        </w:tc>
+        <w:tc>
+          <w:tcPr>
+            <w:tcW w:type="dxa" w:w="2045"/>
+            <w:tcMar>
+              <w:top w:w="50" w:type="dxa"/>
+              <w:bottom w:w="50" w:type="dxa"/>
+              <w:left w:w="80" w:type="dxa"/>
+              <w:right w:w="80" w:type="dxa"/>
+            </w:tcMar>
+            <w:tcBorders>
+              <w:top w:val="single" w:sz="4" w:space="0" w:color="888888"/>
+              <w:left w:val="single" w:sz="4" w:space="0" w:color="888888"/>
+              <w:bottom w:val="single" w:sz="4" w:space="0" w:color="888888"/>
+              <w:right w:val="single" w:sz="4" w:space="0" w:color="888888"/>
+            </w:tcBorders>
+          </w:tcPr>
+          <w:p>
+            <w:r>
               <w:t>{{ item.qty }}</w:t>
             </w:r>
           </w:p>
         </w:tc>
         <w:tc>
           <w:tcPr>
-            <w:tcW w:type="dxa" w:w="1987"/>
+            <w:tcW w:type="dxa" w:w="2045"/>
             <w:tcMar>
-              <w:top w:w="100" w:type="dxa"/>
-              <w:bottom w:w="100" w:type="dxa"/>
-              <w:left w:w="150" w:type="dxa"/>
-              <w:right w:w="150" w:type="dxa"/>
+              <w:top w:w="50" w:type="dxa"/>
+              <w:bottom w:w="50" w:type="dxa"/>
+              <w:left w:w="80" w:type="dxa"/>
+              <w:right w:w="80" w:type="dxa"/>
             </w:tcMar>
+            <w:tcBorders>
+              <w:top w:val="single" w:sz="4" w:space="0" w:color="888888"/>
+              <w:left w:val="single" w:sz="4" w:space="0" w:color="888888"/>
+              <w:bottom w:val="single" w:sz="4" w:space="0" w:color="888888"/>
+              <w:right w:val="single" w:sz="4" w:space="0" w:color="888888"/>
+            </w:tcBorders>
           </w:tcPr>
           <w:p>
             <w:r>
-              <w:rPr>
-                <w:rFonts w:ascii="Times New Roman" w:hAnsi="Times New Roman"/>
-                <w:sz w:val="18"/>
-              </w:rPr>
               <w:t>{{ item.unit_cost }}</w:t>
             </w:r>
           </w:p>
         </w:tc>
         <w:tc>
           <w:tcPr>
-            <w:tcW w:type="dxa" w:w="1987"/>
+            <w:tcW w:type="dxa" w:w="2045"/>
             <w:tcMar>
-              <w:top w:w="100" w:type="dxa"/>
-              <w:bottom w:w="100" w:type="dxa"/>
-              <w:left w:w="150" w:type="dxa"/>
-              <w:right w:w="150" w:type="dxa"/>
+              <w:top w:w="50" w:type="dxa"/>
+              <w:bottom w:w="50" w:type="dxa"/>
+              <w:left w:w="80" w:type="dxa"/>
+              <w:right w:w="80" w:type="dxa"/>
             </w:tcMar>
+            <w:tcBorders>
+              <w:top w:val="single" w:sz="4" w:space="0" w:color="888888"/>
+              <w:left w:val="single" w:sz="4" w:space="0" w:color="888888"/>
+              <w:bottom w:val="single" w:sz="4" w:space="0" w:color="888888"/>
+              <w:right w:val="single" w:sz="4" w:space="0" w:color="888888"/>
+            </w:tcBorders>
+          </w:tcPr>
+          <w:p>
+            <w:r>
+              <w:t>{{ item.total }}</w:t>
+            </w:r>
+          </w:p>
+        </w:tc>
+      </w:tr>
+      <w:tr>
+        <w:tc>
+          <w:tcPr>
+            <w:tcW w:type="dxa" w:w="2045"/>
+            <w:tcMar>
+              <w:top w:w="50" w:type="dxa"/>
+              <w:bottom w:w="50" w:type="dxa"/>
+              <w:left w:w="80" w:type="dxa"/>
+              <w:right w:w="80" w:type="dxa"/>
+            </w:tcMar>
+            <w:tcBorders>
+              <w:top w:val="single" w:sz="4" w:space="0" w:color="888888"/>
+              <w:left w:val="single" w:sz="4" w:space="0" w:color="888888"/>
+              <w:bottom w:val="single" w:sz="4" w:space="0" w:color="888888"/>
+              <w:right w:val="single" w:sz="4" w:space="0" w:color="888888"/>
+            </w:tcBorders>
+          </w:tcPr>
+          <w:p>
+            <w:r>
+              <w:t>{%tr endfor %}</w:t>
+            </w:r>
+          </w:p>
+        </w:tc>
+        <w:tc>
+          <w:tcPr>
+            <w:tcW w:type="dxa" w:w="2045"/>
+            <w:tcMar>
+              <w:top w:w="50" w:type="dxa"/>
+              <w:bottom w:w="50" w:type="dxa"/>
+              <w:left w:w="80" w:type="dxa"/>
+              <w:right w:w="80" w:type="dxa"/>
+            </w:tcMar>
+            <w:tcBorders>
+              <w:top w:val="single" w:sz="4" w:space="0" w:color="888888"/>
+              <w:left w:val="single" w:sz="4" w:space="0" w:color="888888"/>
+              <w:bottom w:val="single" w:sz="4" w:space="0" w:color="888888"/>
+              <w:right w:val="single" w:sz="4" w:space="0" w:color="888888"/>
+            </w:tcBorders>
+          </w:tcPr>
+          <w:p/>
+        </w:tc>
+        <w:tc>
+          <w:tcPr>
+            <w:tcW w:type="dxa" w:w="2045"/>
+            <w:tcMar>
+              <w:top w:w="50" w:type="dxa"/>
+              <w:bottom w:w="50" w:type="dxa"/>
+              <w:left w:w="80" w:type="dxa"/>
+              <w:right w:w="80" w:type="dxa"/>
+            </w:tcMar>
+            <w:tcBorders>
+              <w:top w:val="single" w:sz="4" w:space="0" w:color="888888"/>
+              <w:left w:val="single" w:sz="4" w:space="0" w:color="888888"/>
+              <w:bottom w:val="single" w:sz="4" w:space="0" w:color="888888"/>
+              <w:right w:val="single" w:sz="4" w:space="0" w:color="888888"/>
+            </w:tcBorders>
+          </w:tcPr>
+          <w:p/>
+        </w:tc>
+        <w:tc>
+          <w:tcPr>
+            <w:tcW w:type="dxa" w:w="2045"/>
+            <w:tcMar>
+              <w:top w:w="50" w:type="dxa"/>
+              <w:bottom w:w="50" w:type="dxa"/>
+              <w:left w:w="80" w:type="dxa"/>
+              <w:right w:w="80" w:type="dxa"/>
+            </w:tcMar>
+            <w:tcBorders>
+              <w:top w:val="single" w:sz="4" w:space="0" w:color="888888"/>
+              <w:left w:val="single" w:sz="4" w:space="0" w:color="888888"/>
+              <w:bottom w:val="single" w:sz="4" w:space="0" w:color="888888"/>
+              <w:right w:val="single" w:sz="4" w:space="0" w:color="888888"/>
+            </w:tcBorders>
+          </w:tcPr>
+          <w:p/>
+        </w:tc>
+        <w:tc>
+          <w:tcPr>
+            <w:tcW w:type="dxa" w:w="2045"/>
+            <w:tcMar>
+              <w:top w:w="50" w:type="dxa"/>
+              <w:bottom w:w="50" w:type="dxa"/>
+              <w:left w:w="80" w:type="dxa"/>
+              <w:right w:w="80" w:type="dxa"/>
+            </w:tcMar>
+            <w:tcBorders>
+              <w:top w:val="single" w:sz="4" w:space="0" w:color="888888"/>
+              <w:left w:val="single" w:sz="4" w:space="0" w:color="888888"/>
+              <w:bottom w:val="single" w:sz="4" w:space="0" w:color="888888"/>
+              <w:right w:val="single" w:sz="4" w:space="0" w:color="888888"/>
+            </w:tcBorders>
+          </w:tcPr>
+          <w:p/>
+        </w:tc>
+      </w:tr>
+      <w:tr>
+        <w:tc>
+          <w:tcPr>
+            <w:tcW w:type="dxa" w:w="8180"/>
+            <w:gridSpan w:val="4"/>
+            <w:tcMar>
+              <w:top w:w="50" w:type="dxa"/>
+              <w:bottom w:w="50" w:type="dxa"/>
+              <w:left w:w="80" w:type="dxa"/>
+              <w:right w:w="80" w:type="dxa"/>
+            </w:tcMar>
+            <w:tcBorders>
+              <w:top w:val="single" w:sz="4" w:space="0" w:color="888888"/>
+              <w:left w:val="single" w:sz="4" w:space="0" w:color="888888"/>
+              <w:bottom w:val="single" w:sz="4" w:space="0" w:color="888888"/>
+              <w:right w:val="single" w:sz="4" w:space="0" w:color="888888"/>
+            </w:tcBorders>
+            <w:tcMar>
+              <w:top w:w="50" w:type="dxa"/>
+              <w:bottom w:w="50" w:type="dxa"/>
+              <w:left w:w="80" w:type="dxa"/>
+              <w:right w:w="80" w:type="dxa"/>
+            </w:tcMar>
+            <w:tcBorders>
+              <w:top w:val="single" w:sz="4" w:space="0" w:color="888888"/>
+              <w:left w:val="single" w:sz="4" w:space="0" w:color="888888"/>
+              <w:bottom w:val="single" w:sz="4" w:space="0" w:color="888888"/>
+              <w:right w:val="single" w:sz="4" w:space="0" w:color="888888"/>
+            </w:tcBorders>
+            <w:tcMar>
+              <w:top w:w="50" w:type="dxa"/>
+              <w:bottom w:w="50" w:type="dxa"/>
+              <w:left w:w="80" w:type="dxa"/>
+              <w:right w:w="80" w:type="dxa"/>
+            </w:tcMar>
+            <w:tcBorders>
+              <w:top w:val="single" w:sz="4" w:space="0" w:color="888888"/>
+              <w:left w:val="single" w:sz="4" w:space="0" w:color="888888"/>
+              <w:bottom w:val="single" w:sz="4" w:space="0" w:color="888888"/>
+              <w:right w:val="single" w:sz="4" w:space="0" w:color="888888"/>
+            </w:tcBorders>
+            <w:tcMar>
+              <w:top w:w="50" w:type="dxa"/>
+              <w:bottom w:w="50" w:type="dxa"/>
+              <w:left w:w="80" w:type="dxa"/>
+              <w:right w:w="80" w:type="dxa"/>
+            </w:tcMar>
+            <w:tcBorders>
+              <w:top w:val="single" w:sz="4" w:space="0" w:color="888888"/>
+              <w:left w:val="single" w:sz="4" w:space="0" w:color="888888"/>
+              <w:bottom w:val="single" w:sz="4" w:space="0" w:color="888888"/>
+              <w:right w:val="single" w:sz="4" w:space="0" w:color="888888"/>
+            </w:tcBorders>
           </w:tcPr>
           <w:p>
             <w:r>
               <w:rPr>
-                <w:rFonts w:ascii="Times New Roman" w:hAnsi="Times New Roman"/>
-                <w:sz w:val="18"/>
+                <w:b/>
               </w:rPr>
-              <w:t>{{ item.total }}{% if not loop.last %}</w:t>
-              <w:br/>
-              <w:t>{% endif %}{% endfor %}</w:t>
+              <w:t>Total Amount (Rs.)</w:t>
+            </w:r>
+          </w:p>
+        </w:tc>
+        <w:tc>
+          <w:tcPr>
+            <w:tcW w:type="dxa" w:w="2045"/>
+            <w:tcMar>
+              <w:top w:w="50" w:type="dxa"/>
+              <w:bottom w:w="50" w:type="dxa"/>
+              <w:left w:w="80" w:type="dxa"/>
+              <w:right w:w="80" w:type="dxa"/>
+            </w:tcMar>
+            <w:tcBorders>
+              <w:top w:val="single" w:sz="4" w:space="0" w:color="888888"/>
+              <w:left w:val="single" w:sz="4" w:space="0" w:color="888888"/>
+              <w:bottom w:val="single" w:sz="4" w:space="0" w:color="888888"/>
+              <w:right w:val="single" w:sz="4" w:space="0" w:color="888888"/>
+            </w:tcBorders>
+          </w:tcPr>
+          <w:p>
+            <w:r>
+              <w:rPr>
+                <w:b/>
+              </w:rPr>
+              <w:t>{{ total_amount }}</w:t>
+            </w:r>
+          </w:p>
+        </w:tc>
+      </w:tr>
+      <w:tr>
+        <w:tc>
+          <w:tcPr>
+            <w:tcW w:type="dxa" w:w="8180"/>
+            <w:gridSpan w:val="4"/>
+            <w:tcMar>
+              <w:top w:w="50" w:type="dxa"/>
+              <w:bottom w:w="50" w:type="dxa"/>
+              <w:left w:w="80" w:type="dxa"/>
+              <w:right w:w="80" w:type="dxa"/>
+            </w:tcMar>
+            <w:tcBorders>
+              <w:top w:val="single" w:sz="4" w:space="0" w:color="888888"/>
+              <w:left w:val="single" w:sz="4" w:space="0" w:color="888888"/>
+              <w:bottom w:val="single" w:sz="4" w:space="0" w:color="888888"/>
+              <w:right w:val="single" w:sz="4" w:space="0" w:color="888888"/>
+            </w:tcBorders>
+            <w:tcMar>
+              <w:top w:w="50" w:type="dxa"/>
+              <w:bottom w:w="50" w:type="dxa"/>
+              <w:left w:w="80" w:type="dxa"/>
+              <w:right w:w="80" w:type="dxa"/>
+            </w:tcMar>
+            <w:tcBorders>
+              <w:top w:val="single" w:sz="4" w:space="0" w:color="888888"/>
+              <w:left w:val="single" w:sz="4" w:space="0" w:color="888888"/>
+              <w:bottom w:val="single" w:sz="4" w:space="0" w:color="888888"/>
+              <w:right w:val="single" w:sz="4" w:space="0" w:color="888888"/>
+            </w:tcBorders>
+            <w:tcMar>
+              <w:top w:w="50" w:type="dxa"/>
+              <w:bottom w:w="50" w:type="dxa"/>
+              <w:left w:w="80" w:type="dxa"/>
+              <w:right w:w="80" w:type="dxa"/>
+            </w:tcMar>
+            <w:tcBorders>
+              <w:top w:val="single" w:sz="4" w:space="0" w:color="888888"/>
+              <w:left w:val="single" w:sz="4" w:space="0" w:color="888888"/>
+              <w:bottom w:val="single" w:sz="4" w:space="0" w:color="888888"/>
+              <w:right w:val="single" w:sz="4" w:space="0" w:color="888888"/>
+            </w:tcBorders>
+            <w:tcMar>
+              <w:top w:w="50" w:type="dxa"/>
+              <w:bottom w:w="50" w:type="dxa"/>
+              <w:left w:w="80" w:type="dxa"/>
+              <w:right w:w="80" w:type="dxa"/>
+            </w:tcMar>
+            <w:tcBorders>
+              <w:top w:val="single" w:sz="4" w:space="0" w:color="888888"/>
+              <w:left w:val="single" w:sz="4" w:space="0" w:color="888888"/>
+              <w:bottom w:val="single" w:sz="4" w:space="0" w:color="888888"/>
+              <w:right w:val="single" w:sz="4" w:space="0" w:color="888888"/>
+            </w:tcBorders>
+          </w:tcPr>
+          <w:p>
+            <w:r>
+              <w:rPr>
+                <w:b/>
+              </w:rPr>
+              <w:t>Total Estimated Amount Including Taxes (Rs.)</w:t>
+            </w:r>
+          </w:p>
+        </w:tc>
+        <w:tc>
+          <w:tcPr>
+            <w:tcW w:type="dxa" w:w="2045"/>
+            <w:tcMar>
+              <w:top w:w="50" w:type="dxa"/>
+              <w:bottom w:w="50" w:type="dxa"/>
+              <w:left w:w="80" w:type="dxa"/>
+              <w:right w:w="80" w:type="dxa"/>
+            </w:tcMar>
+            <w:tcBorders>
+              <w:top w:val="single" w:sz="4" w:space="0" w:color="888888"/>
+              <w:left w:val="single" w:sz="4" w:space="0" w:color="888888"/>
+              <w:bottom w:val="single" w:sz="4" w:space="0" w:color="888888"/>
+              <w:right w:val="single" w:sz="4" w:space="0" w:color="888888"/>
+            </w:tcBorders>
+          </w:tcPr>
+          <w:p>
+            <w:r>
+              <w:rPr>
+                <w:b/>
+              </w:rPr>
+              <w:t>{{ grand_total }}</w:t>
             </w:r>
           </w:p>
         </w:tc>
@@ -292,73 +732,1582 @@
     </w:tbl>
     <w:p>
       <w:pPr>
-        <w:spacing w:before="200" w:after="80"/>
+        <w:spacing w:before="160" w:after="40"/>
       </w:pPr>
       <w:r>
         <w:rPr>
-          <w:rFonts w:ascii="Times New Roman" w:hAnsi="Times New Roman"/>
           <w:b/>
-          <w:sz w:val="20"/>
         </w:rPr>
-        <w:t>Supplier / Payee &amp; Banking Details:</w:t>
+        <w:t>SUPPLIER DETAILS</w:t>
+      </w:r>
+    </w:p>
+    <w:tbl>
+      <w:tblPr>
+        <w:tblW w:type="auto" w:w="0"/>
+        <w:jc w:val="center"/>
+        <w:tblLook w:firstColumn="1" w:firstRow="1" w:lastColumn="0" w:lastRow="0" w:noHBand="0" w:noVBand="1" w:val="04A0"/>
+      </w:tblPr>
+      <w:tblGrid>
+        <w:gridCol w:w="3168"/>
+        <w:gridCol w:w="6768"/>
+      </w:tblGrid>
+      <w:tr>
+        <w:tc>
+          <w:tcPr>
+            <w:tcW w:type="dxa" w:w="5112"/>
+            <w:tcMar>
+              <w:top w:w="40" w:type="dxa"/>
+              <w:bottom w:w="40" w:type="dxa"/>
+              <w:left w:w="80" w:type="dxa"/>
+              <w:right w:w="80" w:type="dxa"/>
+            </w:tcMar>
+            <w:tcBorders>
+              <w:top w:val="single" w:sz="4" w:space="0" w:color="888888"/>
+              <w:left w:val="single" w:sz="4" w:space="0" w:color="888888"/>
+              <w:bottom w:val="single" w:sz="4" w:space="0" w:color="888888"/>
+              <w:right w:val="single" w:sz="4" w:space="0" w:color="888888"/>
+            </w:tcBorders>
+          </w:tcPr>
+          <w:p>
+            <w:r>
+              <w:rPr>
+                <w:sz w:val="18"/>
+              </w:rPr>
+              <w:t>Name of the Supplier</w:t>
+            </w:r>
+          </w:p>
+        </w:tc>
+        <w:tc>
+          <w:tcPr>
+            <w:tcW w:type="dxa" w:w="5112"/>
+            <w:tcMar>
+              <w:top w:w="40" w:type="dxa"/>
+              <w:bottom w:w="40" w:type="dxa"/>
+              <w:left w:w="80" w:type="dxa"/>
+              <w:right w:w="80" w:type="dxa"/>
+            </w:tcMar>
+            <w:tcBorders>
+              <w:top w:val="single" w:sz="4" w:space="0" w:color="888888"/>
+              <w:left w:val="single" w:sz="4" w:space="0" w:color="888888"/>
+              <w:bottom w:val="single" w:sz="4" w:space="0" w:color="888888"/>
+              <w:right w:val="single" w:sz="4" w:space="0" w:color="888888"/>
+            </w:tcBorders>
+          </w:tcPr>
+          <w:p>
+            <w:r>
+              <w:rPr>
+                <w:sz w:val="18"/>
+              </w:rPr>
+              <w:t>{{ supplier_name }}</w:t>
+            </w:r>
+          </w:p>
+        </w:tc>
+      </w:tr>
+      <w:tr>
+        <w:tc>
+          <w:tcPr>
+            <w:tcW w:type="dxa" w:w="5112"/>
+            <w:tcMar>
+              <w:top w:w="40" w:type="dxa"/>
+              <w:bottom w:w="40" w:type="dxa"/>
+              <w:left w:w="80" w:type="dxa"/>
+              <w:right w:w="80" w:type="dxa"/>
+            </w:tcMar>
+            <w:tcBorders>
+              <w:top w:val="single" w:sz="4" w:space="0" w:color="888888"/>
+              <w:left w:val="single" w:sz="4" w:space="0" w:color="888888"/>
+              <w:bottom w:val="single" w:sz="4" w:space="0" w:color="888888"/>
+              <w:right w:val="single" w:sz="4" w:space="0" w:color="888888"/>
+            </w:tcBorders>
+          </w:tcPr>
+          <w:p>
+            <w:r>
+              <w:rPr>
+                <w:sz w:val="18"/>
+              </w:rPr>
+              <w:t>GST No.</w:t>
+            </w:r>
+          </w:p>
+        </w:tc>
+        <w:tc>
+          <w:tcPr>
+            <w:tcW w:type="dxa" w:w="5112"/>
+            <w:tcMar>
+              <w:top w:w="40" w:type="dxa"/>
+              <w:bottom w:w="40" w:type="dxa"/>
+              <w:left w:w="80" w:type="dxa"/>
+              <w:right w:w="80" w:type="dxa"/>
+            </w:tcMar>
+            <w:tcBorders>
+              <w:top w:val="single" w:sz="4" w:space="0" w:color="888888"/>
+              <w:left w:val="single" w:sz="4" w:space="0" w:color="888888"/>
+              <w:bottom w:val="single" w:sz="4" w:space="0" w:color="888888"/>
+              <w:right w:val="single" w:sz="4" w:space="0" w:color="888888"/>
+            </w:tcBorders>
+          </w:tcPr>
+          <w:p>
+            <w:r>
+              <w:rPr>
+                <w:sz w:val="18"/>
+              </w:rPr>
+              <w:t>{{ supplier_gst }}</w:t>
+            </w:r>
+          </w:p>
+        </w:tc>
+      </w:tr>
+      <w:tr>
+        <w:tc>
+          <w:tcPr>
+            <w:tcW w:type="dxa" w:w="5112"/>
+            <w:tcMar>
+              <w:top w:w="40" w:type="dxa"/>
+              <w:bottom w:w="40" w:type="dxa"/>
+              <w:left w:w="80" w:type="dxa"/>
+              <w:right w:w="80" w:type="dxa"/>
+            </w:tcMar>
+            <w:tcBorders>
+              <w:top w:val="single" w:sz="4" w:space="0" w:color="888888"/>
+              <w:left w:val="single" w:sz="4" w:space="0" w:color="888888"/>
+              <w:bottom w:val="single" w:sz="4" w:space="0" w:color="888888"/>
+              <w:right w:val="single" w:sz="4" w:space="0" w:color="888888"/>
+            </w:tcBorders>
+          </w:tcPr>
+          <w:p>
+            <w:r>
+              <w:rPr>
+                <w:sz w:val="18"/>
+              </w:rPr>
+              <w:t>Any other Taxes</w:t>
+            </w:r>
+          </w:p>
+        </w:tc>
+        <w:tc>
+          <w:tcPr>
+            <w:tcW w:type="dxa" w:w="5112"/>
+            <w:tcMar>
+              <w:top w:w="40" w:type="dxa"/>
+              <w:bottom w:w="40" w:type="dxa"/>
+              <w:left w:w="80" w:type="dxa"/>
+              <w:right w:w="80" w:type="dxa"/>
+            </w:tcMar>
+            <w:tcBorders>
+              <w:top w:val="single" w:sz="4" w:space="0" w:color="888888"/>
+              <w:left w:val="single" w:sz="4" w:space="0" w:color="888888"/>
+              <w:bottom w:val="single" w:sz="4" w:space="0" w:color="888888"/>
+              <w:right w:val="single" w:sz="4" w:space="0" w:color="888888"/>
+            </w:tcBorders>
+          </w:tcPr>
+          <w:p>
+            <w:r>
+              <w:rPr>
+                <w:sz w:val="18"/>
+              </w:rPr>
+              <w:t>{{ other_taxes }}</w:t>
+            </w:r>
+          </w:p>
+        </w:tc>
+      </w:tr>
+      <w:tr>
+        <w:tc>
+          <w:tcPr>
+            <w:tcW w:type="dxa" w:w="5112"/>
+            <w:tcMar>
+              <w:top w:w="40" w:type="dxa"/>
+              <w:bottom w:w="40" w:type="dxa"/>
+              <w:left w:w="80" w:type="dxa"/>
+              <w:right w:w="80" w:type="dxa"/>
+            </w:tcMar>
+            <w:tcBorders>
+              <w:top w:val="single" w:sz="4" w:space="0" w:color="888888"/>
+              <w:left w:val="single" w:sz="4" w:space="0" w:color="888888"/>
+              <w:bottom w:val="single" w:sz="4" w:space="0" w:color="888888"/>
+              <w:right w:val="single" w:sz="4" w:space="0" w:color="888888"/>
+            </w:tcBorders>
+          </w:tcPr>
+          <w:p>
+            <w:r>
+              <w:rPr>
+                <w:sz w:val="18"/>
+              </w:rPr>
+              <w:t>Invoice No. and date</w:t>
+            </w:r>
+          </w:p>
+        </w:tc>
+        <w:tc>
+          <w:tcPr>
+            <w:tcW w:type="dxa" w:w="5112"/>
+            <w:tcMar>
+              <w:top w:w="40" w:type="dxa"/>
+              <w:bottom w:w="40" w:type="dxa"/>
+              <w:left w:w="80" w:type="dxa"/>
+              <w:right w:w="80" w:type="dxa"/>
+            </w:tcMar>
+            <w:tcBorders>
+              <w:top w:val="single" w:sz="4" w:space="0" w:color="888888"/>
+              <w:left w:val="single" w:sz="4" w:space="0" w:color="888888"/>
+              <w:bottom w:val="single" w:sz="4" w:space="0" w:color="888888"/>
+              <w:right w:val="single" w:sz="4" w:space="0" w:color="888888"/>
+            </w:tcBorders>
+          </w:tcPr>
+          <w:p>
+            <w:r>
+              <w:rPr>
+                <w:sz w:val="18"/>
+              </w:rPr>
+              <w:t>{{ invoice_no }} and {{ invoice_date | date_dmy }}</w:t>
+            </w:r>
+          </w:p>
+        </w:tc>
+      </w:tr>
+      <w:tr>
+        <w:tc>
+          <w:tcPr>
+            <w:tcW w:type="dxa" w:w="5112"/>
+            <w:tcMar>
+              <w:top w:w="40" w:type="dxa"/>
+              <w:bottom w:w="40" w:type="dxa"/>
+              <w:left w:w="80" w:type="dxa"/>
+              <w:right w:w="80" w:type="dxa"/>
+            </w:tcMar>
+            <w:tcBorders>
+              <w:top w:val="single" w:sz="4" w:space="0" w:color="888888"/>
+              <w:left w:val="single" w:sz="4" w:space="0" w:color="888888"/>
+              <w:bottom w:val="single" w:sz="4" w:space="0" w:color="888888"/>
+              <w:right w:val="single" w:sz="4" w:space="0" w:color="888888"/>
+            </w:tcBorders>
+          </w:tcPr>
+          <w:p>
+            <w:r>
+              <w:rPr>
+                <w:sz w:val="18"/>
+              </w:rPr>
+              <w:t>Amount (Rs.)</w:t>
+            </w:r>
+          </w:p>
+        </w:tc>
+        <w:tc>
+          <w:tcPr>
+            <w:tcW w:type="dxa" w:w="5112"/>
+            <w:tcMar>
+              <w:top w:w="40" w:type="dxa"/>
+              <w:bottom w:w="40" w:type="dxa"/>
+              <w:left w:w="80" w:type="dxa"/>
+              <w:right w:w="80" w:type="dxa"/>
+            </w:tcMar>
+            <w:tcBorders>
+              <w:top w:val="single" w:sz="4" w:space="0" w:color="888888"/>
+              <w:left w:val="single" w:sz="4" w:space="0" w:color="888888"/>
+              <w:bottom w:val="single" w:sz="4" w:space="0" w:color="888888"/>
+              <w:right w:val="single" w:sz="4" w:space="0" w:color="888888"/>
+            </w:tcBorders>
+          </w:tcPr>
+          <w:p>
+            <w:r>
+              <w:rPr>
+                <w:sz w:val="18"/>
+              </w:rPr>
+              <w:t>{{ grand_total }}</w:t>
+            </w:r>
+          </w:p>
+        </w:tc>
+      </w:tr>
+    </w:tbl>
+    <w:p>
+      <w:pPr>
+        <w:spacing w:before="160" w:after="40"/>
+      </w:pPr>
+      <w:r>
+        <w:rPr>
+          <w:b/>
+        </w:rPr>
+        <w:t>PAYMENT DETAILS</w:t>
+      </w:r>
+    </w:p>
+    <w:tbl>
+      <w:tblPr>
+        <w:tblW w:type="auto" w:w="0"/>
+        <w:jc w:val="center"/>
+        <w:tblLook w:firstColumn="1" w:firstRow="1" w:lastColumn="0" w:lastRow="0" w:noHBand="0" w:noVBand="1" w:val="04A0"/>
+      </w:tblPr>
+      <w:tblGrid>
+        <w:gridCol w:w="3168"/>
+        <w:gridCol w:w="6768"/>
+      </w:tblGrid>
+      <w:tr>
+        <w:tc>
+          <w:tcPr>
+            <w:tcW w:type="dxa" w:w="5112"/>
+            <w:tcMar>
+              <w:top w:w="40" w:type="dxa"/>
+              <w:bottom w:w="40" w:type="dxa"/>
+              <w:left w:w="80" w:type="dxa"/>
+              <w:right w:w="80" w:type="dxa"/>
+            </w:tcMar>
+            <w:tcBorders>
+              <w:top w:val="single" w:sz="4" w:space="0" w:color="888888"/>
+              <w:left w:val="single" w:sz="4" w:space="0" w:color="888888"/>
+              <w:bottom w:val="single" w:sz="4" w:space="0" w:color="888888"/>
+              <w:right w:val="single" w:sz="4" w:space="0" w:color="888888"/>
+            </w:tcBorders>
+          </w:tcPr>
+          <w:p>
+            <w:r>
+              <w:rPr>
+                <w:sz w:val="18"/>
+              </w:rPr>
+              <w:t>Name of the Party</w:t>
+            </w:r>
+          </w:p>
+        </w:tc>
+        <w:tc>
+          <w:tcPr>
+            <w:tcW w:type="dxa" w:w="5112"/>
+            <w:tcMar>
+              <w:top w:w="40" w:type="dxa"/>
+              <w:bottom w:w="40" w:type="dxa"/>
+              <w:left w:w="80" w:type="dxa"/>
+              <w:right w:w="80" w:type="dxa"/>
+            </w:tcMar>
+            <w:tcBorders>
+              <w:top w:val="single" w:sz="4" w:space="0" w:color="888888"/>
+              <w:left w:val="single" w:sz="4" w:space="0" w:color="888888"/>
+              <w:bottom w:val="single" w:sz="4" w:space="0" w:color="888888"/>
+              <w:right w:val="single" w:sz="4" w:space="0" w:color="888888"/>
+            </w:tcBorders>
+          </w:tcPr>
+          <w:p>
+            <w:r>
+              <w:rPr>
+                <w:sz w:val="18"/>
+              </w:rPr>
+              <w:t>{{ payee_name }}</w:t>
+            </w:r>
+          </w:p>
+        </w:tc>
+      </w:tr>
+      <w:tr>
+        <w:tc>
+          <w:tcPr>
+            <w:tcW w:type="dxa" w:w="5112"/>
+            <w:tcMar>
+              <w:top w:w="40" w:type="dxa"/>
+              <w:bottom w:w="40" w:type="dxa"/>
+              <w:left w:w="80" w:type="dxa"/>
+              <w:right w:w="80" w:type="dxa"/>
+            </w:tcMar>
+            <w:tcBorders>
+              <w:top w:val="single" w:sz="4" w:space="0" w:color="888888"/>
+              <w:left w:val="single" w:sz="4" w:space="0" w:color="888888"/>
+              <w:bottom w:val="single" w:sz="4" w:space="0" w:color="888888"/>
+              <w:right w:val="single" w:sz="4" w:space="0" w:color="888888"/>
+            </w:tcBorders>
+          </w:tcPr>
+          <w:p>
+            <w:r>
+              <w:rPr>
+                <w:sz w:val="18"/>
+              </w:rPr>
+              <w:t>Account Number</w:t>
+            </w:r>
+          </w:p>
+        </w:tc>
+        <w:tc>
+          <w:tcPr>
+            <w:tcW w:type="dxa" w:w="5112"/>
+            <w:tcMar>
+              <w:top w:w="40" w:type="dxa"/>
+              <w:bottom w:w="40" w:type="dxa"/>
+              <w:left w:w="80" w:type="dxa"/>
+              <w:right w:w="80" w:type="dxa"/>
+            </w:tcMar>
+            <w:tcBorders>
+              <w:top w:val="single" w:sz="4" w:space="0" w:color="888888"/>
+              <w:left w:val="single" w:sz="4" w:space="0" w:color="888888"/>
+              <w:bottom w:val="single" w:sz="4" w:space="0" w:color="888888"/>
+              <w:right w:val="single" w:sz="4" w:space="0" w:color="888888"/>
+            </w:tcBorders>
+          </w:tcPr>
+          <w:p>
+            <w:r>
+              <w:rPr>
+                <w:sz w:val="18"/>
+              </w:rPr>
+              <w:t>{{ account_number }}</w:t>
+            </w:r>
+          </w:p>
+        </w:tc>
+      </w:tr>
+      <w:tr>
+        <w:tc>
+          <w:tcPr>
+            <w:tcW w:type="dxa" w:w="5112"/>
+            <w:tcMar>
+              <w:top w:w="40" w:type="dxa"/>
+              <w:bottom w:w="40" w:type="dxa"/>
+              <w:left w:w="80" w:type="dxa"/>
+              <w:right w:w="80" w:type="dxa"/>
+            </w:tcMar>
+            <w:tcBorders>
+              <w:top w:val="single" w:sz="4" w:space="0" w:color="888888"/>
+              <w:left w:val="single" w:sz="4" w:space="0" w:color="888888"/>
+              <w:bottom w:val="single" w:sz="4" w:space="0" w:color="888888"/>
+              <w:right w:val="single" w:sz="4" w:space="0" w:color="888888"/>
+            </w:tcBorders>
+          </w:tcPr>
+          <w:p>
+            <w:r>
+              <w:rPr>
+                <w:sz w:val="18"/>
+              </w:rPr>
+              <w:t>Account Holder Name</w:t>
+            </w:r>
+          </w:p>
+        </w:tc>
+        <w:tc>
+          <w:tcPr>
+            <w:tcW w:type="dxa" w:w="5112"/>
+            <w:tcMar>
+              <w:top w:w="40" w:type="dxa"/>
+              <w:bottom w:w="40" w:type="dxa"/>
+              <w:left w:w="80" w:type="dxa"/>
+              <w:right w:w="80" w:type="dxa"/>
+            </w:tcMar>
+            <w:tcBorders>
+              <w:top w:val="single" w:sz="4" w:space="0" w:color="888888"/>
+              <w:left w:val="single" w:sz="4" w:space="0" w:color="888888"/>
+              <w:bottom w:val="single" w:sz="4" w:space="0" w:color="888888"/>
+              <w:right w:val="single" w:sz="4" w:space="0" w:color="888888"/>
+            </w:tcBorders>
+          </w:tcPr>
+          <w:p>
+            <w:r>
+              <w:rPr>
+                <w:sz w:val="18"/>
+              </w:rPr>
+              <w:t>{{ account_holder }}</w:t>
+            </w:r>
+          </w:p>
+        </w:tc>
+      </w:tr>
+      <w:tr>
+        <w:tc>
+          <w:tcPr>
+            <w:tcW w:type="dxa" w:w="5112"/>
+            <w:tcMar>
+              <w:top w:w="40" w:type="dxa"/>
+              <w:bottom w:w="40" w:type="dxa"/>
+              <w:left w:w="80" w:type="dxa"/>
+              <w:right w:w="80" w:type="dxa"/>
+            </w:tcMar>
+            <w:tcBorders>
+              <w:top w:val="single" w:sz="4" w:space="0" w:color="888888"/>
+              <w:left w:val="single" w:sz="4" w:space="0" w:color="888888"/>
+              <w:bottom w:val="single" w:sz="4" w:space="0" w:color="888888"/>
+              <w:right w:val="single" w:sz="4" w:space="0" w:color="888888"/>
+            </w:tcBorders>
+          </w:tcPr>
+          <w:p>
+            <w:r>
+              <w:rPr>
+                <w:sz w:val="18"/>
+              </w:rPr>
+              <w:t>Name of the Bank</w:t>
+            </w:r>
+          </w:p>
+        </w:tc>
+        <w:tc>
+          <w:tcPr>
+            <w:tcW w:type="dxa" w:w="5112"/>
+            <w:tcMar>
+              <w:top w:w="40" w:type="dxa"/>
+              <w:bottom w:w="40" w:type="dxa"/>
+              <w:left w:w="80" w:type="dxa"/>
+              <w:right w:w="80" w:type="dxa"/>
+            </w:tcMar>
+            <w:tcBorders>
+              <w:top w:val="single" w:sz="4" w:space="0" w:color="888888"/>
+              <w:left w:val="single" w:sz="4" w:space="0" w:color="888888"/>
+              <w:bottom w:val="single" w:sz="4" w:space="0" w:color="888888"/>
+              <w:right w:val="single" w:sz="4" w:space="0" w:color="888888"/>
+            </w:tcBorders>
+          </w:tcPr>
+          <w:p>
+            <w:r>
+              <w:rPr>
+                <w:sz w:val="18"/>
+              </w:rPr>
+              <w:t>{{ bank_name }}</w:t>
+            </w:r>
+          </w:p>
+        </w:tc>
+      </w:tr>
+      <w:tr>
+        <w:tc>
+          <w:tcPr>
+            <w:tcW w:type="dxa" w:w="5112"/>
+            <w:tcMar>
+              <w:top w:w="40" w:type="dxa"/>
+              <w:bottom w:w="40" w:type="dxa"/>
+              <w:left w:w="80" w:type="dxa"/>
+              <w:right w:w="80" w:type="dxa"/>
+            </w:tcMar>
+            <w:tcBorders>
+              <w:top w:val="single" w:sz="4" w:space="0" w:color="888888"/>
+              <w:left w:val="single" w:sz="4" w:space="0" w:color="888888"/>
+              <w:bottom w:val="single" w:sz="4" w:space="0" w:color="888888"/>
+              <w:right w:val="single" w:sz="4" w:space="0" w:color="888888"/>
+            </w:tcBorders>
+          </w:tcPr>
+          <w:p>
+            <w:r>
+              <w:rPr>
+                <w:sz w:val="18"/>
+              </w:rPr>
+              <w:t>Name of the Branch</w:t>
+            </w:r>
+          </w:p>
+        </w:tc>
+        <w:tc>
+          <w:tcPr>
+            <w:tcW w:type="dxa" w:w="5112"/>
+            <w:tcMar>
+              <w:top w:w="40" w:type="dxa"/>
+              <w:bottom w:w="40" w:type="dxa"/>
+              <w:left w:w="80" w:type="dxa"/>
+              <w:right w:w="80" w:type="dxa"/>
+            </w:tcMar>
+            <w:tcBorders>
+              <w:top w:val="single" w:sz="4" w:space="0" w:color="888888"/>
+              <w:left w:val="single" w:sz="4" w:space="0" w:color="888888"/>
+              <w:bottom w:val="single" w:sz="4" w:space="0" w:color="888888"/>
+              <w:right w:val="single" w:sz="4" w:space="0" w:color="888888"/>
+            </w:tcBorders>
+          </w:tcPr>
+          <w:p>
+            <w:r>
+              <w:rPr>
+                <w:sz w:val="18"/>
+              </w:rPr>
+              <w:t>{{ bank_branch }}</w:t>
+            </w:r>
+          </w:p>
+        </w:tc>
+      </w:tr>
+      <w:tr>
+        <w:tc>
+          <w:tcPr>
+            <w:tcW w:type="dxa" w:w="5112"/>
+            <w:tcMar>
+              <w:top w:w="40" w:type="dxa"/>
+              <w:bottom w:w="40" w:type="dxa"/>
+              <w:left w:w="80" w:type="dxa"/>
+              <w:right w:w="80" w:type="dxa"/>
+            </w:tcMar>
+            <w:tcBorders>
+              <w:top w:val="single" w:sz="4" w:space="0" w:color="888888"/>
+              <w:left w:val="single" w:sz="4" w:space="0" w:color="888888"/>
+              <w:bottom w:val="single" w:sz="4" w:space="0" w:color="888888"/>
+              <w:right w:val="single" w:sz="4" w:space="0" w:color="888888"/>
+            </w:tcBorders>
+          </w:tcPr>
+          <w:p>
+            <w:r>
+              <w:rPr>
+                <w:sz w:val="18"/>
+              </w:rPr>
+              <w:t>IFSC Code</w:t>
+            </w:r>
+          </w:p>
+        </w:tc>
+        <w:tc>
+          <w:tcPr>
+            <w:tcW w:type="dxa" w:w="5112"/>
+            <w:tcMar>
+              <w:top w:w="40" w:type="dxa"/>
+              <w:bottom w:w="40" w:type="dxa"/>
+              <w:left w:w="80" w:type="dxa"/>
+              <w:right w:w="80" w:type="dxa"/>
+            </w:tcMar>
+            <w:tcBorders>
+              <w:top w:val="single" w:sz="4" w:space="0" w:color="888888"/>
+              <w:left w:val="single" w:sz="4" w:space="0" w:color="888888"/>
+              <w:bottom w:val="single" w:sz="4" w:space="0" w:color="888888"/>
+              <w:right w:val="single" w:sz="4" w:space="0" w:color="888888"/>
+            </w:tcBorders>
+          </w:tcPr>
+          <w:p>
+            <w:r>
+              <w:rPr>
+                <w:sz w:val="18"/>
+              </w:rPr>
+              <w:t>{{ ifsc }}</w:t>
+            </w:r>
+          </w:p>
+        </w:tc>
+      </w:tr>
+    </w:tbl>
+    <w:p>
+      <w:r>
+        <w:br w:type="page"/>
       </w:r>
     </w:p>
     <w:p>
       <w:pPr>
-        <w:spacing w:line="276" w:lineRule="auto"/>
+        <w:spacing w:before="80" w:after="40"/>
       </w:pPr>
       <w:r>
         <w:rPr>
-          <w:rFonts w:ascii="Times New Roman" w:hAnsi="Times New Roman"/>
-          <w:sz w:val="19"/>
+          <w:b/>
         </w:rPr>
-        <w:t>Supplier / Payee Name: {{ supplier_name or payee_name or '[TO BE FILLED]' }}</w:t>
-        <w:br/>
-        <w:t>GSTIN: {{ supplier_gst or '[TO BE FILLED]' }} | Invoice No: {{ invoice_no or '[TO BE FILLED]' }} | Date: {{ invoice_date or '[TO BE FILLED]' }}</w:t>
-        <w:br/>
-        <w:t>Bank Name: {{ bank_name or '[TO BE FILLED]' }} | Branch: {{ bank_branch or '[TO BE FILLED]' }}</w:t>
-        <w:br/>
-        <w:t>Account Number: {{ account_number or '[TO BE FILLED]' }} | IFSC Code: {{ ifsc or '[TO BE FILLED]' }}</w:t>
-        <w:br/>
+        <w:t>STOCK ENTRY DETAILS</w:t>
       </w:r>
     </w:p>
     <w:p>
       <w:pPr>
-        <w:spacing w:before="160"/>
+        <w:spacing w:after="80"/>
       </w:pPr>
       <w:r>
         <w:rPr>
-          <w:rFonts w:ascii="Times New Roman" w:hAnsi="Times New Roman"/>
-          <w:i/>
-          <w:sz w:val="18"/>
+          <w:sz w:val="19"/>
         </w:rPr>
-        <w:t>CERTIFICATE: Certified that the items/services mentioned above have been received in good condition, verified as per rate and specifications, and entered in the stock register of the student council/chapter.</w:t>
+        <w:t>Name of the Laboratory / Office: {{ stock_office }}</w:t>
+      </w:r>
+    </w:p>
+    <w:tbl>
+      <w:tblPr>
+        <w:tblW w:type="auto" w:w="0"/>
+        <w:jc w:val="center"/>
+        <w:tblLook w:firstColumn="1" w:firstRow="1" w:lastColumn="0" w:lastRow="0" w:noHBand="0" w:noVBand="1" w:val="04A0"/>
+      </w:tblPr>
+      <w:tblGrid>
+        <w:gridCol w:w="2592"/>
+        <w:gridCol w:w="2592"/>
+        <w:gridCol w:w="2592"/>
+        <w:gridCol w:w="2160"/>
+      </w:tblGrid>
+      <w:tr>
+        <w:tc>
+          <w:tcPr>
+            <w:tcW w:type="dxa" w:w="2556"/>
+            <w:shd w:fill="EAEAEA"/>
+            <w:tcMar>
+              <w:top w:w="40" w:type="dxa"/>
+              <w:bottom w:w="40" w:type="dxa"/>
+              <w:left w:w="60" w:type="dxa"/>
+              <w:right w:w="60" w:type="dxa"/>
+            </w:tcMar>
+            <w:tcBorders>
+              <w:top w:val="single" w:sz="4" w:space="0" w:color="888888"/>
+              <w:left w:val="single" w:sz="4" w:space="0" w:color="888888"/>
+              <w:bottom w:val="single" w:sz="4" w:space="0" w:color="888888"/>
+              <w:right w:val="single" w:sz="4" w:space="0" w:color="888888"/>
+            </w:tcBorders>
+          </w:tcPr>
+          <w:p>
+            <w:r>
+              <w:rPr>
+                <w:b/>
+              </w:rPr>
+              <w:t>Recurring Register</w:t>
+            </w:r>
+          </w:p>
+        </w:tc>
+        <w:tc>
+          <w:tcPr>
+            <w:tcW w:type="dxa" w:w="2556"/>
+            <w:shd w:fill="EAEAEA"/>
+            <w:tcMar>
+              <w:top w:w="40" w:type="dxa"/>
+              <w:bottom w:w="40" w:type="dxa"/>
+              <w:left w:w="60" w:type="dxa"/>
+              <w:right w:w="60" w:type="dxa"/>
+            </w:tcMar>
+            <w:tcBorders>
+              <w:top w:val="single" w:sz="4" w:space="0" w:color="888888"/>
+              <w:left w:val="single" w:sz="4" w:space="0" w:color="888888"/>
+              <w:bottom w:val="single" w:sz="4" w:space="0" w:color="888888"/>
+              <w:right w:val="single" w:sz="4" w:space="0" w:color="888888"/>
+            </w:tcBorders>
+          </w:tcPr>
+          <w:p>
+            <w:r>
+              <w:rPr>
+                <w:b/>
+              </w:rPr>
+              <w:t>Consumable Register</w:t>
+            </w:r>
+          </w:p>
+        </w:tc>
+        <w:tc>
+          <w:tcPr>
+            <w:tcW w:type="dxa" w:w="2556"/>
+            <w:shd w:fill="EAEAEA"/>
+            <w:tcMar>
+              <w:top w:w="40" w:type="dxa"/>
+              <w:bottom w:w="40" w:type="dxa"/>
+              <w:left w:w="60" w:type="dxa"/>
+              <w:right w:w="60" w:type="dxa"/>
+            </w:tcMar>
+            <w:tcBorders>
+              <w:top w:val="single" w:sz="4" w:space="0" w:color="888888"/>
+              <w:left w:val="single" w:sz="4" w:space="0" w:color="888888"/>
+              <w:bottom w:val="single" w:sz="4" w:space="0" w:color="888888"/>
+              <w:right w:val="single" w:sz="4" w:space="0" w:color="888888"/>
+            </w:tcBorders>
+          </w:tcPr>
+          <w:p>
+            <w:r>
+              <w:rPr>
+                <w:b/>
+              </w:rPr>
+              <w:t>Miscellaneous Register</w:t>
+            </w:r>
+          </w:p>
+        </w:tc>
+        <w:tc>
+          <w:tcPr>
+            <w:tcW w:type="dxa" w:w="2556"/>
+            <w:shd w:fill="EAEAEA"/>
+            <w:tcMar>
+              <w:top w:w="40" w:type="dxa"/>
+              <w:bottom w:w="40" w:type="dxa"/>
+              <w:left w:w="60" w:type="dxa"/>
+              <w:right w:w="60" w:type="dxa"/>
+            </w:tcMar>
+            <w:tcBorders>
+              <w:top w:val="single" w:sz="4" w:space="0" w:color="888888"/>
+              <w:left w:val="single" w:sz="4" w:space="0" w:color="888888"/>
+              <w:bottom w:val="single" w:sz="4" w:space="0" w:color="888888"/>
+              <w:right w:val="single" w:sz="4" w:space="0" w:color="888888"/>
+            </w:tcBorders>
+          </w:tcPr>
+          <w:p>
+            <w:r>
+              <w:rPr>
+                <w:b/>
+              </w:rPr>
+              <w:t>Clerk / Staff Signature</w:t>
+            </w:r>
+          </w:p>
+        </w:tc>
+      </w:tr>
+      <w:tr>
+        <w:tc>
+          <w:tcPr>
+            <w:tcW w:type="dxa" w:w="2556"/>
+            <w:tcMar>
+              <w:top w:w="40" w:type="dxa"/>
+              <w:bottom w:w="40" w:type="dxa"/>
+              <w:left w:w="60" w:type="dxa"/>
+              <w:right w:w="60" w:type="dxa"/>
+            </w:tcMar>
+            <w:tcBorders>
+              <w:top w:val="single" w:sz="4" w:space="0" w:color="888888"/>
+              <w:left w:val="single" w:sz="4" w:space="0" w:color="888888"/>
+              <w:bottom w:val="single" w:sz="4" w:space="0" w:color="888888"/>
+              <w:right w:val="single" w:sz="4" w:space="0" w:color="888888"/>
+            </w:tcBorders>
+          </w:tcPr>
+          <w:p>
+            <w:r>
+              <w:rPr>
+                <w:sz w:val="17"/>
+              </w:rPr>
+              <w:t>Name/Type: {{ stock_register_type }}</w:t>
+            </w:r>
+          </w:p>
+        </w:tc>
+        <w:tc>
+          <w:tcPr>
+            <w:tcW w:type="dxa" w:w="2556"/>
+            <w:tcMar>
+              <w:top w:w="40" w:type="dxa"/>
+              <w:bottom w:w="40" w:type="dxa"/>
+              <w:left w:w="60" w:type="dxa"/>
+              <w:right w:w="60" w:type="dxa"/>
+            </w:tcMar>
+            <w:tcBorders>
+              <w:top w:val="single" w:sz="4" w:space="0" w:color="888888"/>
+              <w:left w:val="single" w:sz="4" w:space="0" w:color="888888"/>
+              <w:bottom w:val="single" w:sz="4" w:space="0" w:color="888888"/>
+              <w:right w:val="single" w:sz="4" w:space="0" w:color="888888"/>
+            </w:tcBorders>
+          </w:tcPr>
+          <w:p>
+            <w:r>
+              <w:rPr>
+                <w:sz w:val="17"/>
+              </w:rPr>
+              <w:t>-</w:t>
+            </w:r>
+          </w:p>
+        </w:tc>
+        <w:tc>
+          <w:tcPr>
+            <w:tcW w:type="dxa" w:w="2556"/>
+            <w:tcMar>
+              <w:top w:w="40" w:type="dxa"/>
+              <w:bottom w:w="40" w:type="dxa"/>
+              <w:left w:w="60" w:type="dxa"/>
+              <w:right w:w="60" w:type="dxa"/>
+            </w:tcMar>
+            <w:tcBorders>
+              <w:top w:val="single" w:sz="4" w:space="0" w:color="888888"/>
+              <w:left w:val="single" w:sz="4" w:space="0" w:color="888888"/>
+              <w:bottom w:val="single" w:sz="4" w:space="0" w:color="888888"/>
+              <w:right w:val="single" w:sz="4" w:space="0" w:color="888888"/>
+            </w:tcBorders>
+          </w:tcPr>
+          <w:p>
+            <w:r>
+              <w:rPr>
+                <w:sz w:val="17"/>
+              </w:rPr>
+              <w:t>-</w:t>
+            </w:r>
+          </w:p>
+        </w:tc>
+        <w:tc>
+          <w:tcPr>
+            <w:tcW w:type="dxa" w:w="2556"/>
+            <w:tcMar>
+              <w:top w:w="40" w:type="dxa"/>
+              <w:bottom w:w="40" w:type="dxa"/>
+              <w:left w:w="60" w:type="dxa"/>
+              <w:right w:w="60" w:type="dxa"/>
+            </w:tcMar>
+            <w:tcBorders>
+              <w:top w:val="single" w:sz="4" w:space="0" w:color="888888"/>
+              <w:left w:val="single" w:sz="4" w:space="0" w:color="888888"/>
+              <w:bottom w:val="single" w:sz="4" w:space="0" w:color="888888"/>
+              <w:right w:val="single" w:sz="4" w:space="0" w:color="888888"/>
+            </w:tcBorders>
+          </w:tcPr>
+          <w:p>
+            <w:r>
+              <w:rPr>
+                <w:sz w:val="17"/>
+              </w:rPr>
+            </w:r>
+          </w:p>
+        </w:tc>
+      </w:tr>
+      <w:tr>
+        <w:tc>
+          <w:tcPr>
+            <w:tcW w:type="dxa" w:w="2556"/>
+            <w:tcMar>
+              <w:top w:w="40" w:type="dxa"/>
+              <w:bottom w:w="40" w:type="dxa"/>
+              <w:left w:w="60" w:type="dxa"/>
+              <w:right w:w="60" w:type="dxa"/>
+            </w:tcMar>
+            <w:tcBorders>
+              <w:top w:val="single" w:sz="4" w:space="0" w:color="888888"/>
+              <w:left w:val="single" w:sz="4" w:space="0" w:color="888888"/>
+              <w:bottom w:val="single" w:sz="4" w:space="0" w:color="888888"/>
+              <w:right w:val="single" w:sz="4" w:space="0" w:color="888888"/>
+            </w:tcBorders>
+          </w:tcPr>
+          <w:p>
+            <w:r>
+              <w:rPr>
+                <w:sz w:val="17"/>
+              </w:rPr>
+              <w:t>Serial Number: {{ stock_serial_no }}</w:t>
+            </w:r>
+          </w:p>
+        </w:tc>
+        <w:tc>
+          <w:tcPr>
+            <w:tcW w:type="dxa" w:w="2556"/>
+            <w:tcMar>
+              <w:top w:w="40" w:type="dxa"/>
+              <w:bottom w:w="40" w:type="dxa"/>
+              <w:left w:w="60" w:type="dxa"/>
+              <w:right w:w="60" w:type="dxa"/>
+            </w:tcMar>
+            <w:tcBorders>
+              <w:top w:val="single" w:sz="4" w:space="0" w:color="888888"/>
+              <w:left w:val="single" w:sz="4" w:space="0" w:color="888888"/>
+              <w:bottom w:val="single" w:sz="4" w:space="0" w:color="888888"/>
+              <w:right w:val="single" w:sz="4" w:space="0" w:color="888888"/>
+            </w:tcBorders>
+          </w:tcPr>
+          <w:p>
+            <w:r>
+              <w:rPr>
+                <w:sz w:val="17"/>
+              </w:rPr>
+              <w:t>-</w:t>
+            </w:r>
+          </w:p>
+        </w:tc>
+        <w:tc>
+          <w:tcPr>
+            <w:tcW w:type="dxa" w:w="2556"/>
+            <w:tcMar>
+              <w:top w:w="40" w:type="dxa"/>
+              <w:bottom w:w="40" w:type="dxa"/>
+              <w:left w:w="60" w:type="dxa"/>
+              <w:right w:w="60" w:type="dxa"/>
+            </w:tcMar>
+            <w:tcBorders>
+              <w:top w:val="single" w:sz="4" w:space="0" w:color="888888"/>
+              <w:left w:val="single" w:sz="4" w:space="0" w:color="888888"/>
+              <w:bottom w:val="single" w:sz="4" w:space="0" w:color="888888"/>
+              <w:right w:val="single" w:sz="4" w:space="0" w:color="888888"/>
+            </w:tcBorders>
+          </w:tcPr>
+          <w:p>
+            <w:r>
+              <w:rPr>
+                <w:sz w:val="17"/>
+              </w:rPr>
+              <w:t>-</w:t>
+            </w:r>
+          </w:p>
+        </w:tc>
+        <w:tc>
+          <w:tcPr>
+            <w:tcW w:type="dxa" w:w="2556"/>
+            <w:tcMar>
+              <w:top w:w="40" w:type="dxa"/>
+              <w:bottom w:w="40" w:type="dxa"/>
+              <w:left w:w="60" w:type="dxa"/>
+              <w:right w:w="60" w:type="dxa"/>
+            </w:tcMar>
+            <w:tcBorders>
+              <w:top w:val="single" w:sz="4" w:space="0" w:color="888888"/>
+              <w:left w:val="single" w:sz="4" w:space="0" w:color="888888"/>
+              <w:bottom w:val="single" w:sz="4" w:space="0" w:color="888888"/>
+              <w:right w:val="single" w:sz="4" w:space="0" w:color="888888"/>
+            </w:tcBorders>
+          </w:tcPr>
+          <w:p>
+            <w:r>
+              <w:rPr>
+                <w:sz w:val="17"/>
+              </w:rPr>
+            </w:r>
+          </w:p>
+        </w:tc>
+      </w:tr>
+      <w:tr>
+        <w:tc>
+          <w:tcPr>
+            <w:tcW w:type="dxa" w:w="2556"/>
+            <w:tcMar>
+              <w:top w:w="40" w:type="dxa"/>
+              <w:bottom w:w="40" w:type="dxa"/>
+              <w:left w:w="60" w:type="dxa"/>
+              <w:right w:w="60" w:type="dxa"/>
+            </w:tcMar>
+            <w:tcBorders>
+              <w:top w:val="single" w:sz="4" w:space="0" w:color="888888"/>
+              <w:left w:val="single" w:sz="4" w:space="0" w:color="888888"/>
+              <w:bottom w:val="single" w:sz="4" w:space="0" w:color="888888"/>
+              <w:right w:val="single" w:sz="4" w:space="0" w:color="888888"/>
+            </w:tcBorders>
+          </w:tcPr>
+          <w:p>
+            <w:r>
+              <w:rPr>
+                <w:sz w:val="17"/>
+              </w:rPr>
+              <w:t>Page Number: {{ stock_page_no }}</w:t>
+            </w:r>
+          </w:p>
+        </w:tc>
+        <w:tc>
+          <w:tcPr>
+            <w:tcW w:type="dxa" w:w="2556"/>
+            <w:tcMar>
+              <w:top w:w="40" w:type="dxa"/>
+              <w:bottom w:w="40" w:type="dxa"/>
+              <w:left w:w="60" w:type="dxa"/>
+              <w:right w:w="60" w:type="dxa"/>
+            </w:tcMar>
+            <w:tcBorders>
+              <w:top w:val="single" w:sz="4" w:space="0" w:color="888888"/>
+              <w:left w:val="single" w:sz="4" w:space="0" w:color="888888"/>
+              <w:bottom w:val="single" w:sz="4" w:space="0" w:color="888888"/>
+              <w:right w:val="single" w:sz="4" w:space="0" w:color="888888"/>
+            </w:tcBorders>
+          </w:tcPr>
+          <w:p>
+            <w:r>
+              <w:rPr>
+                <w:sz w:val="17"/>
+              </w:rPr>
+              <w:t>-</w:t>
+            </w:r>
+          </w:p>
+        </w:tc>
+        <w:tc>
+          <w:tcPr>
+            <w:tcW w:type="dxa" w:w="2556"/>
+            <w:tcMar>
+              <w:top w:w="40" w:type="dxa"/>
+              <w:bottom w:w="40" w:type="dxa"/>
+              <w:left w:w="60" w:type="dxa"/>
+              <w:right w:w="60" w:type="dxa"/>
+            </w:tcMar>
+            <w:tcBorders>
+              <w:top w:val="single" w:sz="4" w:space="0" w:color="888888"/>
+              <w:left w:val="single" w:sz="4" w:space="0" w:color="888888"/>
+              <w:bottom w:val="single" w:sz="4" w:space="0" w:color="888888"/>
+              <w:right w:val="single" w:sz="4" w:space="0" w:color="888888"/>
+            </w:tcBorders>
+          </w:tcPr>
+          <w:p>
+            <w:r>
+              <w:rPr>
+                <w:sz w:val="17"/>
+              </w:rPr>
+              <w:t>-</w:t>
+            </w:r>
+          </w:p>
+        </w:tc>
+        <w:tc>
+          <w:tcPr>
+            <w:tcW w:type="dxa" w:w="2556"/>
+            <w:tcMar>
+              <w:top w:w="40" w:type="dxa"/>
+              <w:bottom w:w="40" w:type="dxa"/>
+              <w:left w:w="60" w:type="dxa"/>
+              <w:right w:w="60" w:type="dxa"/>
+            </w:tcMar>
+            <w:tcBorders>
+              <w:top w:val="single" w:sz="4" w:space="0" w:color="888888"/>
+              <w:left w:val="single" w:sz="4" w:space="0" w:color="888888"/>
+              <w:bottom w:val="single" w:sz="4" w:space="0" w:color="888888"/>
+              <w:right w:val="single" w:sz="4" w:space="0" w:color="888888"/>
+            </w:tcBorders>
+          </w:tcPr>
+          <w:p>
+            <w:r>
+              <w:rPr>
+                <w:sz w:val="17"/>
+              </w:rPr>
+            </w:r>
+          </w:p>
+        </w:tc>
+      </w:tr>
+      <w:tr>
+        <w:tc>
+          <w:tcPr>
+            <w:tcW w:type="dxa" w:w="2556"/>
+            <w:tcMar>
+              <w:top w:w="40" w:type="dxa"/>
+              <w:bottom w:w="40" w:type="dxa"/>
+              <w:left w:w="60" w:type="dxa"/>
+              <w:right w:w="60" w:type="dxa"/>
+            </w:tcMar>
+            <w:tcBorders>
+              <w:top w:val="single" w:sz="4" w:space="0" w:color="888888"/>
+              <w:left w:val="single" w:sz="4" w:space="0" w:color="888888"/>
+              <w:bottom w:val="single" w:sz="4" w:space="0" w:color="888888"/>
+              <w:right w:val="single" w:sz="4" w:space="0" w:color="888888"/>
+            </w:tcBorders>
+          </w:tcPr>
+          <w:p>
+            <w:r>
+              <w:rPr>
+                <w:sz w:val="17"/>
+              </w:rPr>
+              <w:t>Date: {{ stock_date | date_dmy }}</w:t>
+            </w:r>
+          </w:p>
+        </w:tc>
+        <w:tc>
+          <w:tcPr>
+            <w:tcW w:type="dxa" w:w="2556"/>
+            <w:tcMar>
+              <w:top w:w="40" w:type="dxa"/>
+              <w:bottom w:w="40" w:type="dxa"/>
+              <w:left w:w="60" w:type="dxa"/>
+              <w:right w:w="60" w:type="dxa"/>
+            </w:tcMar>
+            <w:tcBorders>
+              <w:top w:val="single" w:sz="4" w:space="0" w:color="888888"/>
+              <w:left w:val="single" w:sz="4" w:space="0" w:color="888888"/>
+              <w:bottom w:val="single" w:sz="4" w:space="0" w:color="888888"/>
+              <w:right w:val="single" w:sz="4" w:space="0" w:color="888888"/>
+            </w:tcBorders>
+          </w:tcPr>
+          <w:p>
+            <w:r>
+              <w:rPr>
+                <w:sz w:val="17"/>
+              </w:rPr>
+              <w:t>-</w:t>
+            </w:r>
+          </w:p>
+        </w:tc>
+        <w:tc>
+          <w:tcPr>
+            <w:tcW w:type="dxa" w:w="2556"/>
+            <w:tcMar>
+              <w:top w:w="40" w:type="dxa"/>
+              <w:bottom w:w="40" w:type="dxa"/>
+              <w:left w:w="60" w:type="dxa"/>
+              <w:right w:w="60" w:type="dxa"/>
+            </w:tcMar>
+            <w:tcBorders>
+              <w:top w:val="single" w:sz="4" w:space="0" w:color="888888"/>
+              <w:left w:val="single" w:sz="4" w:space="0" w:color="888888"/>
+              <w:bottom w:val="single" w:sz="4" w:space="0" w:color="888888"/>
+              <w:right w:val="single" w:sz="4" w:space="0" w:color="888888"/>
+            </w:tcBorders>
+          </w:tcPr>
+          <w:p>
+            <w:r>
+              <w:rPr>
+                <w:sz w:val="17"/>
+              </w:rPr>
+              <w:t>-</w:t>
+            </w:r>
+          </w:p>
+        </w:tc>
+        <w:tc>
+          <w:tcPr>
+            <w:tcW w:type="dxa" w:w="2556"/>
+            <w:tcMar>
+              <w:top w:w="40" w:type="dxa"/>
+              <w:bottom w:w="40" w:type="dxa"/>
+              <w:left w:w="60" w:type="dxa"/>
+              <w:right w:w="60" w:type="dxa"/>
+            </w:tcMar>
+            <w:tcBorders>
+              <w:top w:val="single" w:sz="4" w:space="0" w:color="888888"/>
+              <w:left w:val="single" w:sz="4" w:space="0" w:color="888888"/>
+              <w:bottom w:val="single" w:sz="4" w:space="0" w:color="888888"/>
+              <w:right w:val="single" w:sz="4" w:space="0" w:color="888888"/>
+            </w:tcBorders>
+          </w:tcPr>
+          <w:p>
+            <w:r>
+              <w:rPr>
+                <w:sz w:val="17"/>
+              </w:rPr>
+            </w:r>
+          </w:p>
+        </w:tc>
+      </w:tr>
+    </w:tbl>
+    <w:p>
+      <w:pPr>
+        <w:spacing w:before="160" w:after="40"/>
+      </w:pPr>
+      <w:r>
+        <w:rPr>
+          <w:b/>
+        </w:rPr>
+        <w:t>INDENTER DETAILS</w:t>
+      </w:r>
+    </w:p>
+    <w:tbl>
+      <w:tblPr>
+        <w:tblW w:type="auto" w:w="0"/>
+        <w:jc w:val="center"/>
+        <w:tblLook w:firstColumn="1" w:firstRow="1" w:lastColumn="0" w:lastRow="0" w:noHBand="0" w:noVBand="1" w:val="04A0"/>
+      </w:tblPr>
+      <w:tblGrid>
+        <w:gridCol w:w="5040"/>
+        <w:gridCol w:w="4896"/>
+      </w:tblGrid>
+      <w:tr>
+        <w:tc>
+          <w:tcPr>
+            <w:tcW w:type="dxa" w:w="5112"/>
+            <w:tcMar>
+              <w:top w:w="50" w:type="dxa"/>
+              <w:bottom w:w="50" w:type="dxa"/>
+              <w:left w:w="80" w:type="dxa"/>
+              <w:right w:w="80" w:type="dxa"/>
+            </w:tcMar>
+            <w:tcBorders>
+              <w:top w:val="single" w:sz="4" w:space="0" w:color="888888"/>
+              <w:left w:val="single" w:sz="4" w:space="0" w:color="888888"/>
+              <w:bottom w:val="single" w:sz="4" w:space="0" w:color="888888"/>
+              <w:right w:val="single" w:sz="4" w:space="0" w:color="888888"/>
+            </w:tcBorders>
+          </w:tcPr>
+          <w:p>
+            <w:r>
+              <w:rPr>
+                <w:sz w:val="19"/>
+              </w:rPr>
+              <w:t>Name of Faculty Chairman:</w:t>
+              <w:br/>
+              <w:t>{{ faculty_chairman_name }}</w:t>
+            </w:r>
+          </w:p>
+        </w:tc>
+        <w:tc>
+          <w:tcPr>
+            <w:tcW w:type="dxa" w:w="5112"/>
+            <w:tcMar>
+              <w:top w:w="50" w:type="dxa"/>
+              <w:bottom w:w="50" w:type="dxa"/>
+              <w:left w:w="80" w:type="dxa"/>
+              <w:right w:w="80" w:type="dxa"/>
+            </w:tcMar>
+            <w:tcBorders>
+              <w:top w:val="single" w:sz="4" w:space="0" w:color="888888"/>
+              <w:left w:val="single" w:sz="4" w:space="0" w:color="888888"/>
+              <w:bottom w:val="single" w:sz="4" w:space="0" w:color="888888"/>
+              <w:right w:val="single" w:sz="4" w:space="0" w:color="888888"/>
+            </w:tcBorders>
+          </w:tcPr>
+          <w:p>
+            <w:r>
+              <w:rPr>
+                <w:sz w:val="19"/>
+              </w:rPr>
+              <w:t>Designation:</w:t>
+              <w:br/>
+              <w:t>{{ faculty_chairman_designation }}</w:t>
+            </w:r>
+          </w:p>
+        </w:tc>
+      </w:tr>
+      <w:tr>
+        <w:tc>
+          <w:tcPr>
+            <w:tcW w:type="dxa" w:w="5112"/>
+            <w:tcMar>
+              <w:top w:w="50" w:type="dxa"/>
+              <w:bottom w:w="50" w:type="dxa"/>
+              <w:left w:w="80" w:type="dxa"/>
+              <w:right w:w="80" w:type="dxa"/>
+            </w:tcMar>
+            <w:tcBorders>
+              <w:top w:val="single" w:sz="4" w:space="0" w:color="888888"/>
+              <w:left w:val="single" w:sz="4" w:space="0" w:color="888888"/>
+              <w:bottom w:val="single" w:sz="4" w:space="0" w:color="888888"/>
+              <w:right w:val="single" w:sz="4" w:space="0" w:color="888888"/>
+            </w:tcBorders>
+          </w:tcPr>
+          <w:p>
+            <w:r>
+              <w:rPr>
+                <w:sz w:val="19"/>
+              </w:rPr>
+              <w:t>Department: {{ department }}</w:t>
+            </w:r>
+          </w:p>
+        </w:tc>
+        <w:tc>
+          <w:tcPr>
+            <w:tcW w:type="dxa" w:w="5112"/>
+            <w:tcMar>
+              <w:top w:w="50" w:type="dxa"/>
+              <w:bottom w:w="50" w:type="dxa"/>
+              <w:left w:w="80" w:type="dxa"/>
+              <w:right w:w="80" w:type="dxa"/>
+            </w:tcMar>
+            <w:tcBorders>
+              <w:top w:val="single" w:sz="4" w:space="0" w:color="888888"/>
+              <w:left w:val="single" w:sz="4" w:space="0" w:color="888888"/>
+              <w:bottom w:val="single" w:sz="4" w:space="0" w:color="888888"/>
+              <w:right w:val="single" w:sz="4" w:space="0" w:color="888888"/>
+            </w:tcBorders>
+          </w:tcPr>
+          <w:p>
+            <w:r>
+              <w:rPr>
+                <w:sz w:val="19"/>
+              </w:rPr>
+              <w:t>Signature with Date:</w:t>
+              <w:br/>
+              <w:br/>
+              <w:t>_______________________</w:t>
+            </w:r>
+          </w:p>
+        </w:tc>
+      </w:tr>
+    </w:tbl>
+    <w:p>
+      <w:pPr>
+        <w:spacing w:before="160" w:after="80"/>
+      </w:pPr>
+      <w:r>
+        <w:rPr>
+          <w:sz w:val="19"/>
+        </w:rPr>
+        <w:t>Recommendation (Head of the Department)</w:t>
+        <w:br/>
+        <w:t>Recommended Amount: Rs. {{ grand_total }}</w:t>
+        <w:br/>
+        <w:t>Approved and Recommended for Bill Payment</w:t>
+        <w:br/>
+        <w:br/>
+        <w:t>Date: {{ approval_date | date_dmy }}</w:t>
+        <w:tab/>
+        <w:tab/>
+        <w:tab/>
+        <w:tab/>
+        <w:t>Dean Student Welfare</w:t>
       </w:r>
     </w:p>
     <w:p>
       <w:pPr>
-        <w:spacing w:before="700"/>
+        <w:spacing w:before="160" w:after="80"/>
       </w:pPr>
       <w:r>
         <w:rPr>
-          <w:rFonts w:ascii="Times New Roman" w:hAnsi="Times New Roman"/>
           <w:b/>
           <w:sz w:val="20"/>
         </w:rPr>
-        <w:t>Indenter / Faculty Coordinator</w:t>
+        <w:t>(FOR USE IN ACCOUNT SECTION)</w:t>
+      </w:r>
+    </w:p>
+    <w:p>
+      <w:r>
+        <w:rPr>
+          <w:sz w:val="18"/>
+        </w:rPr>
+        <w:t>Date:</w:t>
+        <w:br/>
+        <w:t>Head of Account :</w:t>
+        <w:br/>
+        <w:t>Budget Code No. :</w:t>
+        <w:br/>
+        <w:t>Mode of Payment  : Cash / Cheque / Online / Adjusted Against Advance</w:t>
+        <w:br/>
+        <w:t>Details of Mode of Payment :</w:t>
+        <w:br/>
+        <w:t>Voucher No. and Date :</w:t>
+        <w:br/>
+        <w:t>Passed for payment/adjustment of Amount in (Rs.) _________________ (in figs.) ________________</w:t>
+        <w:br/>
+        <w:t>(in words) _________________________________________________________________</w:t>
+        <w:br/>
+        <w:br/>
+        <w:br/>
+        <w:t>Office Supt.</w:t>
         <w:tab/>
         <w:tab/>
-        <w:t>Dean (Student Welfare)</w:t>
+        <w:tab/>
+        <w:t>Dy. Registrar (A/cs.)</w:t>
+        <w:tab/>
+        <w:tab/>
+        <w:tab/>
+        <w:t>Registrar / Director</w:t>
       </w:r>
     </w:p>
     <w:sectPr>
+      <w:headerReference w:type="default" r:id="rId9"/>
+      <w:footerReference w:type="default" r:id="rId10"/>
       <w:pgSz w:w="12240" w:h="15840"/>
-      <w:pgMar w:top="1008" w:right="1152" w:bottom="1008" w:left="1152" w:header="720" w:footer="720" w:gutter="0"/>
+      <w:pgMar w:top="720" w:right="1008" w:bottom="720" w:left="1008" w:header="720" w:footer="720" w:gutter="0"/>
       <w:cols w:space="720"/>
       <w:docGrid w:linePitch="360"/>
     </w:sectPr>
   </w:body>
 </w:document>
+</file>
+
+<file path=word/footer1.xml><?xml version="1.0" encoding="utf-8"?>
+<w:ftr xmlns:m="http://schemas.openxmlformats.org/officeDocument/2006/math" xmlns:mc="http://schemas.openxmlformats.org/markup-compatibility/2006" xmlns:mo="http://schemas.microsoft.com/office/mac/office/2008/main" xmlns:mv="urn:schemas-microsoft-com:mac:vml" xmlns:o="urn:schemas-microsoft-com:office:office" xmlns:r="http://schemas.openxmlformats.org/officeDocument/2006/relationships" xmlns:v="urn:schemas-microsoft-com:vml" xmlns:w10="urn:schemas-microsoft-com:office:word" xmlns:w14="http://schemas.microsoft.com/office/word/2010/wordml" xmlns:w="http://schemas.openxmlformats.org/wordprocessingml/2006/main" xmlns:wne="http://schemas.microsoft.com/office/word/2006/wordml" xmlns:wp14="http://schemas.microsoft.com/office/word/2010/wordprocessingDrawing" xmlns:wp="http://schemas.openxmlformats.org/drawingml/2006/wordprocessingDrawing" xmlns:wpc="http://schemas.microsoft.com/office/word/2010/wordprocessingCanvas" xmlns:wpg="http://schemas.microsoft.com/office/word/2010/wordprocessingGroup" xmlns:wpi="http://schemas.microsoft.com/office/word/2010/wordprocessingInk" xmlns:wps="http://schemas.microsoft.com/office/word/2010/wordprocessingShape" mc:Ignorable="w14 wp14">
+  <w:p>
+    <w:pPr>
+      <w:pStyle w:val="Footer"/>
+      <w:jc w:val="right"/>
+    </w:pPr>
+    <w:r>
+      <w:rPr>
+        <w:rFonts w:ascii="Times New Roman" w:hAnsi="Times New Roman"/>
+        <w:color w:val="666666"/>
+        <w:sz w:val="18"/>
+      </w:rPr>
+      <w:t xml:space="preserve">Page </w:t>
+    </w:r>
+    <w:fldSimple w:instr="PAGE"/>
+    <w:r>
+      <w:rPr>
+        <w:rFonts w:ascii="Times New Roman" w:hAnsi="Times New Roman"/>
+        <w:color w:val="666666"/>
+        <w:sz w:val="18"/>
+      </w:rPr>
+      <w:t xml:space="preserve"> of </w:t>
+    </w:r>
+    <w:fldSimple w:instr="NUMPAGES"/>
+  </w:p>
+</w:ftr>
+</file>
+
+<file path=word/header1.xml><?xml version="1.0" encoding="utf-8"?>
+<w:hdr xmlns:m="http://schemas.openxmlformats.org/officeDocument/2006/math" xmlns:mc="http://schemas.openxmlformats.org/markup-compatibility/2006" xmlns:mo="http://schemas.microsoft.com/office/mac/office/2008/main" xmlns:mv="urn:schemas-microsoft-com:mac:vml" xmlns:o="urn:schemas-microsoft-com:office:office" xmlns:r="http://schemas.openxmlformats.org/officeDocument/2006/relationships" xmlns:v="urn:schemas-microsoft-com:vml" xmlns:w10="urn:schemas-microsoft-com:office:word" xmlns:w14="http://schemas.microsoft.com/office/word/2010/wordml" xmlns:w="http://schemas.openxmlformats.org/wordprocessingml/2006/main" xmlns:wne="http://schemas.microsoft.com/office/word/2006/wordml" xmlns:wp14="http://schemas.microsoft.com/office/word/2010/wordprocessingDrawing" xmlns:wp="http://schemas.openxmlformats.org/drawingml/2006/wordprocessingDrawing" xmlns:wpc="http://schemas.microsoft.com/office/word/2010/wordprocessingCanvas" xmlns:wpg="http://schemas.microsoft.com/office/word/2010/wordprocessingGroup" xmlns:wpi="http://schemas.microsoft.com/office/word/2010/wordprocessingInk" xmlns:wps="http://schemas.microsoft.com/office/word/2010/wordprocessingShape" mc:Ignorable="w14 wp14">
+  <w:p>
+    <w:pPr>
+      <w:pStyle w:val="Header"/>
+    </w:pPr>
+    <w:r/>
+  </w:p>
+  <w:tbl>
+    <w:tblPr>
+      <w:tblW w:type="auto" w:w="0"/>
+      <w:jc w:val="center"/>
+      <w:tblLook w:firstColumn="1" w:firstRow="1" w:lastColumn="0" w:lastRow="0" w:noHBand="0" w:noVBand="1" w:val="04A0"/>
+    </w:tblPr>
+    <w:tblGrid>
+      <w:gridCol w:w="1584"/>
+      <w:gridCol w:w="6624"/>
+      <w:gridCol w:w="1584"/>
+    </w:tblGrid>
+    <w:tr>
+      <w:tc>
+        <w:tcPr>
+          <w:tcW w:type="dxa" w:w="3264"/>
+          <w:vAlign w:val="center"/>
+          <w:tcBorders>
+            <w:top w:val="none"/>
+            <w:left w:val="none"/>
+            <w:bottom w:val="none"/>
+            <w:right w:val="none"/>
+          </w:tcBorders>
+        </w:tcPr>
+        <w:p>
+          <w:pPr>
+            <w:jc w:val="left"/>
+          </w:pPr>
+          <w:r>
+            <w:drawing>
+              <wp:inline xmlns:a="http://schemas.openxmlformats.org/drawingml/2006/main" xmlns:pic="http://schemas.openxmlformats.org/drawingml/2006/picture">
+                <wp:extent cx="777240" cy="743690"/>
+                <wp:docPr id="1" name="Picture 1"/>
+                <wp:cNvGraphicFramePr>
+                  <a:graphicFrameLocks noChangeAspect="1"/>
+                </wp:cNvGraphicFramePr>
+                <a:graphic>
+                  <a:graphicData uri="http://schemas.openxmlformats.org/drawingml/2006/picture">
+                    <pic:pic>
+                      <pic:nvPicPr>
+                        <pic:cNvPr id="0" name="svnit_logo.png"/>
+                        <pic:cNvPicPr/>
+                      </pic:nvPicPr>
+                      <pic:blipFill>
+                        <a:blip r:embed="rId1"/>
+                        <a:stretch>
+                          <a:fillRect/>
+                        </a:stretch>
+                      </pic:blipFill>
+                      <pic:spPr>
+                        <a:xfrm>
+                          <a:off x="0" y="0"/>
+                          <a:ext cx="777240" cy="743690"/>
+                        </a:xfrm>
+                        <a:prstGeom prst="rect"/>
+                      </pic:spPr>
+                    </pic:pic>
+                  </a:graphicData>
+                </a:graphic>
+              </wp:inline>
+            </w:drawing>
+          </w:r>
+        </w:p>
+      </w:tc>
+      <w:tc>
+        <w:tcPr>
+          <w:tcW w:type="dxa" w:w="3264"/>
+          <w:vAlign w:val="center"/>
+          <w:tcBorders>
+            <w:top w:val="none"/>
+            <w:left w:val="none"/>
+            <w:bottom w:val="none"/>
+            <w:right w:val="none"/>
+          </w:tcBorders>
+        </w:tcPr>
+        <w:p>
+          <w:pPr>
+            <w:jc w:val="center"/>
+          </w:pPr>
+          <w:r>
+            <w:rPr>
+              <w:rFonts w:ascii="Times New Roman" w:hAnsi="Times New Roman"/>
+              <w:b/>
+              <w:color w:val="4F81BD"/>
+              <w:sz w:val="24"/>
+            </w:rPr>
+            <w:t>ASSOCIATION for COMPUTING MACHINERY</w:t>
+            <w:br/>
+          </w:r>
+          <w:r>
+            <w:rPr>
+              <w:rFonts w:ascii="Times New Roman" w:hAnsi="Times New Roman"/>
+              <w:b/>
+              <w:color w:val="222222"/>
+              <w:sz w:val="17"/>
+            </w:rPr>
+            <w:t>SARDAR VALLABHBHAI NATIONAL INSTITUTE OF TECHNOLOGY, SURAT</w:t>
+          </w:r>
+        </w:p>
+      </w:tc>
+      <w:tc>
+        <w:tcPr>
+          <w:tcW w:type="dxa" w:w="3264"/>
+          <w:vAlign w:val="center"/>
+          <w:tcBorders>
+            <w:top w:val="none"/>
+            <w:left w:val="none"/>
+            <w:bottom w:val="none"/>
+            <w:right w:val="none"/>
+          </w:tcBorders>
+        </w:tcPr>
+        <w:p>
+          <w:pPr>
+            <w:jc w:val="right"/>
+          </w:pPr>
+          <w:r>
+            <w:drawing>
+              <wp:inline xmlns:a="http://schemas.openxmlformats.org/drawingml/2006/main" xmlns:pic="http://schemas.openxmlformats.org/drawingml/2006/picture">
+                <wp:extent cx="777240" cy="777240"/>
+                <wp:docPr id="2" name="Picture 2"/>
+                <wp:cNvGraphicFramePr>
+                  <a:graphicFrameLocks noChangeAspect="1"/>
+                </wp:cNvGraphicFramePr>
+                <a:graphic>
+                  <a:graphicData uri="http://schemas.openxmlformats.org/drawingml/2006/picture">
+                    <pic:pic>
+                      <pic:nvPicPr>
+                        <pic:cNvPr id="0" name="acm_logo.png"/>
+                        <pic:cNvPicPr/>
+                      </pic:nvPicPr>
+                      <pic:blipFill>
+                        <a:blip r:embed="rId2"/>
+                        <a:stretch>
+                          <a:fillRect/>
+                        </a:stretch>
+                      </pic:blipFill>
+                      <pic:spPr>
+                        <a:xfrm>
+                          <a:off x="0" y="0"/>
+                          <a:ext cx="777240" cy="777240"/>
+                        </a:xfrm>
+                        <a:prstGeom prst="rect"/>
+                      </pic:spPr>
+                    </pic:pic>
+                  </a:graphicData>
+                </a:graphic>
+              </wp:inline>
+            </w:drawing>
+          </w:r>
+        </w:p>
+      </w:tc>
+    </w:tr>
+  </w:tbl>
+  <w:p>
+    <w:pPr>
+      <w:spacing w:before="80" w:after="160"/>
+      <w:pBdr>
+        <w:bottom w:val="single" w:sz="8" w:space="1" w:color="4F81BD"/>
+      </w:pBdr>
+    </w:pPr>
+  </w:p>
+</w:hdr>
 </file>
 
 <file path=word/numbering.xml><?xml version="1.0" encoding="utf-8"?>

</xml_diff>